<commit_message>
Route all FR422 submissions through Google Classroom
The five Part A maps and the Part B report now both go through Google
Classroom instead of emailing the maps to the lecturer. One submission
point, timestamps, and no email attachment-size issues.

Brief:
- Section 1: "Submit everything through Google Classroom: the five map
  files and the Part B report."
- Due row: "Five maps and report PDF via Google Classroom"
- Section 8: maps "submitted through Google Classroom" (was "emailed
  directly to the lecturer")

Step-by-step guide (MD): Submit-your-work section, Step 5 intro, and
Step 6 export step all updated to Google Classroom.

Generated with [Devin](https://devin.ai)

Co-Authored-By: Devin <158243242+devin-ai-integration[bot]@users.noreply.github.com>
</commit_message>
<xml_diff>
--- a/practical_assignment/FR422_Assignment_Brief_Habitat_Conservation_Plan.docx
+++ b/practical_assignment/FR422_Assignment_Brief_Habitat_Conservation_Plan.docx
@@ -168,7 +168,7 @@
           <w:color w:val="222222"/>
           <w:sz w:val="22"/>
         </w:rPr>
-        <w:t>•  Submit the Part B report through Google Classroom and email the five map files directly to the lecturer. Late work without good cause is zero.</w:t>
+        <w:t>•  Submit everything through Google Classroom: the five map files and the Part B report. Late work without good cause is zero.</w:t>
       </w:r>
     </w:p>
     <w:p>
@@ -588,7 +588,7 @@
                 <w:color w:val="222222"/>
                 <w:sz w:val="18"/>
               </w:rPr>
-              <w:t>Report PDF via Google Classroom; five maps emailed to the lecturer</w:t>
+              <w:t>Five maps and report PDF via Google Classroom</w:t>
             </w:r>
           </w:p>
         </w:tc>
@@ -2190,7 +2190,7 @@
           <w:color w:val="222222"/>
           <w:sz w:val="22"/>
         </w:rPr>
-        <w:t>•  Five maps, PNG or PDF, emailed directly to the lecturer: map 1 (study area), map 2 (attribute), map 3 (spatial pattern), map 4 (habitat proxy), and the gap-analysis map. Named Surname_lab_map1_study_area and the same pattern for maps 2 to 4; the gap-analysis map is named Surname_lab_gap_analysis.</w:t>
+        <w:t>•  Five maps, PNG or PDF, submitted through Google Classroom: map 1 (study area), map 2 (attribute), map 3 (spatial pattern), map 4 (habitat proxy), and the gap-analysis map. Named Surname_lab_map1_study_area and the same pattern for maps 2 to 4; the gap-analysis map is named Surname_lab_gap_analysis.</w:t>
       </w:r>
     </w:p>
     <w:p>

</xml_diff>

<commit_message>
Remove M1/M2 milestones; lecturer issues species files directly
Students pick from the Excel species list, lecturer confirms, and
receives the species geojson directly — no milestone forms, no
draft-map check. Dates table now only has Revised issue and Due.

Generated with [Devin](https://devin.ai)

Co-Authored-By: Devin <158243242+devin-ai-integration[bot]@users.noreply.github.com>
</commit_message>
<xml_diff>
--- a/practical_assignment/FR422_Assignment_Brief_Habitat_Conservation_Plan.docx
+++ b/practical_assignment/FR422_Assignment_Brief_Habitat_Conservation_Plan.docx
@@ -89,7 +89,7 @@
           <w:color w:val="222222"/>
           <w:sz w:val="20"/>
         </w:rPr>
-        <w:t>Revised issue: Week 8, Wednesday 9 September 2026. This brief replaces the unpublished Week 6 brief for this offering only. The approved lesson plan still lists the assignment as set in Week 6, Milestone 1 in Week 7, Milestone 2 in Week 9, and due in Week 12. Those outline dates are not the dates for this submission. Use the dates below.</w:t>
+        <w:t>Revised issue: Week 8, Wednesday 9 September 2026. This brief replaces the unpublished Week 6 brief for this offering only. The approved lesson plan still lists the assignment as set in Week 6 and due in Week 12. That outline date is not the date for this submission. Use the date below.</w:t>
       </w:r>
     </w:p>
     <w:p>
@@ -351,7 +351,9 @@
             </w:tcBorders>
           </w:tcPr>
           <w:p>
-            <w:r/>
+            <w:r>
+              <w:t>This brief, the species list, and the GIS practical guide</w:t>
+            </w:r>
             <w:r>
               <w:rPr>
                 <w:rFonts w:ascii="Calibri" w:hAnsi="Calibri" w:eastAsia="Calibri"/>
@@ -360,158 +362,6 @@
                 <w:color w:val="222222"/>
                 <w:sz w:val="18"/>
               </w:rPr>
-              <w:t>This brief, the Milestone 1 form, the species list, and the Week 9 GIS guide</w:t>
-            </w:r>
-          </w:p>
-        </w:tc>
-      </w:tr>
-      <w:tr>
-        <w:tc>
-          <w:tcPr>
-            <w:tcW w:type="dxa" w:w="3289"/>
-            <w:shd w:fill="F4F7F5" w:val="clear"/>
-            <w:tcBorders>
-              <w:top w:val="single" w:sz="4" w:color="D0D5D2"/>
-              <w:left w:val="single" w:sz="4" w:color="D0D5D2"/>
-              <w:bottom w:val="single" w:sz="4" w:color="D0D5D2"/>
-              <w:right w:val="single" w:sz="4" w:color="D0D5D2"/>
-            </w:tcBorders>
-          </w:tcPr>
-          <w:p>
-            <w:r/>
-            <w:r>
-              <w:rPr>
-                <w:rFonts w:ascii="Calibri" w:hAnsi="Calibri" w:eastAsia="Calibri"/>
-                <w:b w:val="0"/>
-                <w:i w:val="0"/>
-                <w:color w:val="222222"/>
-                <w:sz w:val="18"/>
-              </w:rPr>
-              <w:t>Milestone 1</w:t>
-            </w:r>
-          </w:p>
-        </w:tc>
-        <w:tc>
-          <w:tcPr>
-            <w:tcW w:type="dxa" w:w="3289"/>
-            <w:shd w:fill="F4F7F5" w:val="clear"/>
-            <w:tcBorders>
-              <w:top w:val="single" w:sz="4" w:color="D0D5D2"/>
-              <w:left w:val="single" w:sz="4" w:color="D0D5D2"/>
-              <w:bottom w:val="single" w:sz="4" w:color="D0D5D2"/>
-              <w:right w:val="single" w:sz="4" w:color="D0D5D2"/>
-            </w:tcBorders>
-          </w:tcPr>
-          <w:p>
-            <w:r/>
-            <w:r>
-              <w:rPr>
-                <w:rFonts w:ascii="Calibri" w:hAnsi="Calibri" w:eastAsia="Calibri"/>
-                <w:b w:val="0"/>
-                <w:i w:val="0"/>
-                <w:color w:val="222222"/>
-                <w:sz w:val="18"/>
-              </w:rPr>
-              <w:t>Monday 14 September 2026, 4:00 pm</w:t>
-            </w:r>
-          </w:p>
-        </w:tc>
-        <w:tc>
-          <w:tcPr>
-            <w:tcW w:type="dxa" w:w="3289"/>
-            <w:shd w:fill="F4F7F5" w:val="clear"/>
-            <w:tcBorders>
-              <w:top w:val="single" w:sz="4" w:color="D0D5D2"/>
-              <w:left w:val="single" w:sz="4" w:color="D0D5D2"/>
-              <w:bottom w:val="single" w:sz="4" w:color="D0D5D2"/>
-              <w:right w:val="single" w:sz="4" w:color="D0D5D2"/>
-            </w:tcBorders>
-          </w:tcPr>
-          <w:p>
-            <w:r/>
-            <w:r>
-              <w:rPr>
-                <w:rFonts w:ascii="Calibri" w:hAnsi="Calibri" w:eastAsia="Calibri"/>
-                <w:b w:val="0"/>
-                <w:i w:val="0"/>
-                <w:color w:val="222222"/>
-                <w:sz w:val="18"/>
-              </w:rPr>
-              <w:t>Ungraded and compulsory. Species approval. No approval, no final mark.</w:t>
-            </w:r>
-          </w:p>
-        </w:tc>
-      </w:tr>
-      <w:tr>
-        <w:tc>
-          <w:tcPr>
-            <w:tcW w:type="dxa" w:w="3289"/>
-            <w:tcBorders>
-              <w:top w:val="single" w:sz="4" w:color="D0D5D2"/>
-              <w:left w:val="single" w:sz="4" w:color="D0D5D2"/>
-              <w:bottom w:val="single" w:sz="4" w:color="D0D5D2"/>
-              <w:right w:val="single" w:sz="4" w:color="D0D5D2"/>
-            </w:tcBorders>
-          </w:tcPr>
-          <w:p>
-            <w:r/>
-            <w:r>
-              <w:rPr>
-                <w:rFonts w:ascii="Calibri" w:hAnsi="Calibri" w:eastAsia="Calibri"/>
-                <w:b w:val="0"/>
-                <w:i w:val="0"/>
-                <w:color w:val="222222"/>
-                <w:sz w:val="18"/>
-              </w:rPr>
-              <w:t>Milestone 2</w:t>
-            </w:r>
-          </w:p>
-        </w:tc>
-        <w:tc>
-          <w:tcPr>
-            <w:tcW w:type="dxa" w:w="3289"/>
-            <w:tcBorders>
-              <w:top w:val="single" w:sz="4" w:color="D0D5D2"/>
-              <w:left w:val="single" w:sz="4" w:color="D0D5D2"/>
-              <w:bottom w:val="single" w:sz="4" w:color="D0D5D2"/>
-              <w:right w:val="single" w:sz="4" w:color="D0D5D2"/>
-            </w:tcBorders>
-          </w:tcPr>
-          <w:p>
-            <w:r/>
-            <w:r>
-              <w:rPr>
-                <w:rFonts w:ascii="Calibri" w:hAnsi="Calibri" w:eastAsia="Calibri"/>
-                <w:b w:val="0"/>
-                <w:i w:val="0"/>
-                <w:color w:val="222222"/>
-                <w:sz w:val="18"/>
-              </w:rPr>
-              <w:t>Friday 18 September 2026, 4:00 pm</w:t>
-            </w:r>
-          </w:p>
-        </w:tc>
-        <w:tc>
-          <w:tcPr>
-            <w:tcW w:type="dxa" w:w="3289"/>
-            <w:tcBorders>
-              <w:top w:val="single" w:sz="4" w:color="D0D5D2"/>
-              <w:left w:val="single" w:sz="4" w:color="D0D5D2"/>
-              <w:bottom w:val="single" w:sz="4" w:color="D0D5D2"/>
-              <w:right w:val="single" w:sz="4" w:color="D0D5D2"/>
-            </w:tcBorders>
-          </w:tcPr>
-          <w:p>
-            <w:r/>
-            <w:r>
-              <w:rPr>
-                <w:rFonts w:ascii="Calibri" w:hAnsi="Calibri" w:eastAsia="Calibri"/>
-                <w:b w:val="0"/>
-                <w:i w:val="0"/>
-                <w:color w:val="222222"/>
-                <w:sz w:val="18"/>
-              </w:rPr>
-              <w:t>Week 9 GIS lab and draft-map check. Bring five draft maps. This is the only remaining computer lab.</w:t>
             </w:r>
           </w:p>
         </w:tc>
@@ -641,7 +491,7 @@
           <w:color w:val="222222"/>
           <w:sz w:val="22"/>
         </w:rPr>
-        <w:t>There is no GIS lab in Week 8. Submit Milestone 1 this week (Monday 14 September, 4:00 pm). The Week 9 lab, Friday 18 September, starts with one shared training file so the class learns the same click-path. For the marked maps you pick a species from the FR422 assignment list, the lecturer checks it, and you receive that species file before the lab. Do not download a national layer. Do not use another student's file. Campus bandwidth is not a reason to leave the lab without a map.</w:t>
+        <w:t>The lecturer issues the FR422 assignment species list (Excel). You pick one species, the lecturer confirms it, and the lecturer sends you that species file directly. No two students take the same species. The Week 9 lab starts with one shared training file so the class learns the same click-path. Do not download a national layer. Do not use another student's file. Campus bandwidth is not a reason to leave the lab without a map.</w:t>
       </w:r>
     </w:p>
     <w:tbl>
@@ -1786,7 +1636,7 @@
           <w:color w:val="222222"/>
           <w:sz w:val="22"/>
         </w:rPr>
-        <w:t>Choose one species from the FR422 assignment species list. Approval is first come at Milestone 1. No two students take the same species. Look up the IUCN category on the Red List and cite the account, including the date you checked it. After the lecturer approves, you receive that species geojson. Do not start the five marked maps until you have your issued file.</w:t>
+        <w:t>Choose one species from the FR422 assignment species list (Excel). The lecturer confirms your choice and sends you that species geojson. No two students take the same species. Look up the IUCN category on the Red List and cite the account, including the date you checked it. Do not start the five marked maps until you have your issued file.</w:t>
       </w:r>
     </w:p>
     <w:p>
@@ -2143,7 +1993,7 @@
           <w:color w:val="222222"/>
           <w:sz w:val="22"/>
         </w:rPr>
-        <w:t>•  Monitoring: what you would remeasure, where, and how you would know the action had failed. Presence of your Milestone 1 species is a monitoring target only if you say it is not in the lab file.</w:t>
+        <w:t>•  Monitoring: what you would remeasure, where, and how you would know the action had failed. Presence of your approved species is a monitoring target only if you say it is not in the lab file.</w:t>
       </w:r>
     </w:p>
     <w:p>
@@ -4522,7 +4372,7 @@
           <w:color w:val="222222"/>
           <w:sz w:val="20"/>
         </w:rPr>
-        <w:t>Pair this brief with the Milestone 1 form and the GIS practical guide for the Week 9 lab. The lab guide is the click path. This brief is the marked specification.</w:t>
+        <w:t>Pair this brief with the GIS practical guide for the Week 9 lab. The lab guide is the click path. This brief is the marked specification.</w:t>
       </w:r>
     </w:p>
     <w:sectPr>

</xml_diff>

<commit_message>
Extend FR422 due date to Friday 2 October 2026 (Week 11)
Practical given Friday 18 September; students work for two weeks and
submit on 2 October (Week 11) instead of 25 September (Week 10).

Generated with [Devin](https://devin.ai)

Co-Authored-By: Devin <158243242+devin-ai-integration[bot]@users.noreply.github.com>
</commit_message>
<xml_diff>
--- a/practical_assignment/FR422_Assignment_Brief_Habitat_Conservation_Plan.docx
+++ b/practical_assignment/FR422_Assignment_Brief_Habitat_Conservation_Plan.docx
@@ -404,7 +404,9 @@
             </w:tcBorders>
           </w:tcPr>
           <w:p>
-            <w:r/>
+            <w:r>
+              <w:t>Friday 2 October 2026 (Week 11), 4:00 pm</w:t>
+            </w:r>
             <w:r>
               <w:rPr>
                 <w:rFonts w:ascii="Calibri" w:hAnsi="Calibri" w:eastAsia="Calibri"/>
@@ -413,7 +415,6 @@
                 <w:color w:val="222222"/>
                 <w:sz w:val="18"/>
               </w:rPr>
-              <w:t>Friday 25 September 2026 (Week 10), 4:00 pm</w:t>
             </w:r>
           </w:p>
         </w:tc>

</xml_diff>

<commit_message>
Add plain-language field dictionary for BIO1/BIO12/BIO15 and all attributes
Students now get units and ecological meaning for each field:
- bio1: annual mean temperature (°C)
- bio12/rainfall_mm: annual precipitation (mm/year)
- bio15: precipitation seasonality (CV×100, higher = stronger dry season)
- elevation_m, tree_cover_pct, worldcover_label, site, stateProvince, etc.

Added to the MD guide (full table), final DOCX guide (full table),
and brief (inline summary paragraph after the attributes row).

Generated with [Devin](https://devin.ai)

Co-Authored-By: Devin <158243242+devin-ai-integration[bot]@users.noreply.github.com>
</commit_message>
<xml_diff>
--- a/practical_assignment/FR422_Assignment_Brief_Habitat_Conservation_Plan.docx
+++ b/practical_assignment/FR422_Assignment_Brief_Habitat_Conservation_Plan.docx
@@ -1119,6 +1119,21 @@
         </w:tc>
       </w:tr>
     </w:tbl>
+    <w:p>
+      <w:pPr>
+        <w:spacing w:before="0" w:after="40"/>
+      </w:pPr>
+      <w:r>
+        <w:rPr>
+          <w:rFonts w:ascii="Calibri" w:hAnsi="Calibri" w:eastAsia="Calibri"/>
+          <w:b w:val="0"/>
+          <w:i w:val="0"/>
+          <w:color w:val="1B4332"/>
+          <w:sz w:val="20"/>
+        </w:rPr>
+        <w:t>Attributes in your species file: elevation_m (metres above sea level, from WorldClim 2.1); tree_cover_pct (canopy cover %, 0–100, from ESA WorldCover 2021); rainfall_mm (annual rainfall in mm/year, from WorldClim 2.1 BIO12); bio1 (annual mean temperature in °C, from WorldClim 2.1); bio15 (precipitation seasonality — coefficient of variation × 100, from WorldClim 2.1; higher values mean a stronger dry season); worldcover_label (ESA WorldCover 2021 land-cover class, e.g. Tree cover, Cropland); site (GBIF site code); stateProvince (PNG province); gbifID (GBIF record identifier); year (record year). The full field dictionary is in the GIS practical guide.</w:t>
+      </w:r>
+    </w:p>
     <w:p>
       <w:pPr>
         <w:spacing w:after="80"/>

</xml_diff>

<commit_message>
Humanize brief and example report formatting
Remove AI writing patterns from both documents:
- Replace dot separators (·) in headers with commas
- Replace em dashes with commas, periods, or "to"
- Replace bold inline headers with plain text
- Replace >= symbols with "at or above" in body text
- Remove "serves as"/"stands as" in favor of "is"
- Fix figure captions to use commas instead of em dashes
- Update example report to reference five maps (not four)
- Word count: 2,035 (within 2,000-2,500 range)

Generated with [Devin](https://devin.ai)

Co-Authored-By: Devin <158243242+devin-ai-integration[bot]@users.noreply.github.com>
</commit_message>
<xml_diff>
--- a/practical_assignment/FR422_Assignment_Brief_Habitat_Conservation_Plan.docx
+++ b/practical_assignment/FR422_Assignment_Brief_Habitat_Conservation_Plan.docx
@@ -44,7 +44,7 @@
           <w:color w:val="1B4332"/>
           <w:sz w:val="32"/>
         </w:rPr>
-        <w:t>FR422  ·  Forest Wildlife and Habitat</w:t>
+        <w:t>FR422, Forest Wildlife and Habitat</w:t>
       </w:r>
     </w:p>
     <w:p>
@@ -74,7 +74,7 @@
           <w:color w:val="555555"/>
           <w:sz w:val="22"/>
         </w:rPr>
-        <w:t>Assignment brief and rubric  ·  Semester 2, 2026  ·  Dr Jimmy Moses</w:t>
+        <w:t>Assignment brief and rubric, Semester 2, 2026, Dr Jimmy Moses</w:t>
       </w:r>
     </w:p>
     <w:p>
@@ -1131,7 +1131,7 @@
           <w:color w:val="1B4332"/>
           <w:sz w:val="20"/>
         </w:rPr>
-        <w:t>Attributes in your species file: elevation_m (metres above sea level, from WorldClim 2.1); tree_cover_pct (canopy cover %, 0–100, from ESA WorldCover 2021); rainfall_mm (annual rainfall in mm/year, from WorldClim 2.1 BIO12); bio1 (annual mean temperature in °C, from WorldClim 2.1); bio15 (precipitation seasonality — coefficient of variation × 100, from WorldClim 2.1; higher values mean a stronger dry season); worldcover_label (ESA WorldCover 2021 land-cover class, e.g. Tree cover, Cropland); site (GBIF site code); stateProvince (PNG province); gbifID (GBIF record identifier); year (record year). The full field dictionary is in the GIS practical guide.</w:t>
+        <w:t>Attributes in your species file: elevation_m (metres above sea level, from WorldClim 2.1); tree_cover_pct (canopy cover %, 0–100, from ESA WorldCover 2021); rainfall_mm (annual rainfall in mm/year, from WorldClim 2.1 BIO12); bio1 (annual mean temperature in °C, from WorldClim 2.1); bio15 (precipitation seasonality, coefficient of variation × 100, from WorldClim 2.1; higher values mean a stronger dry season); worldcover_label (ESA WorldCover 2021 land-cover class, e.g. Tree cover, Cropland); site (GBIF site code); stateProvince (PNG province); gbifID (GBIF record identifier); year (record year). The full field dictionary is in the GIS practical guide.</w:t>
       </w:r>
     </w:p>
     <w:p>
@@ -1505,7 +1505,9 @@
             </w:tcBorders>
           </w:tcPr>
           <w:p>
-            <w:r/>
+            <w:r>
+              <w:t>-</w:t>
+            </w:r>
             <w:r>
               <w:rPr>
                 <w:rFonts w:ascii="Calibri" w:hAnsi="Calibri" w:eastAsia="Calibri"/>
@@ -1514,7 +1516,6 @@
                 <w:color w:val="222222"/>
                 <w:sz w:val="18"/>
               </w:rPr>
-              <w:t>—</w:t>
             </w:r>
           </w:p>
         </w:tc>
@@ -1555,7 +1556,9 @@
             </w:tcBorders>
           </w:tcPr>
           <w:p>
-            <w:r/>
+            <w:r>
+              <w:t>-</w:t>
+            </w:r>
             <w:r>
               <w:rPr>
                 <w:rFonts w:ascii="Calibri" w:hAnsi="Calibri" w:eastAsia="Calibri"/>
@@ -1564,7 +1567,6 @@
                 <w:color w:val="222222"/>
                 <w:sz w:val="18"/>
               </w:rPr>
-              <w:t>—</w:t>
             </w:r>
           </w:p>
         </w:tc>
@@ -1580,7 +1582,9 @@
             </w:tcBorders>
           </w:tcPr>
           <w:p>
-            <w:r/>
+            <w:r>
+              <w:t>-</w:t>
+            </w:r>
             <w:r>
               <w:rPr>
                 <w:rFonts w:ascii="Calibri" w:hAnsi="Calibri" w:eastAsia="Calibri"/>
@@ -1589,7 +1593,6 @@
                 <w:color w:val="222222"/>
                 <w:sz w:val="18"/>
               </w:rPr>
-              <w:t>—</w:t>
             </w:r>
           </w:p>
         </w:tc>
@@ -1605,7 +1608,9 @@
             </w:tcBorders>
           </w:tcPr>
           <w:p>
-            <w:r/>
+            <w:r>
+              <w:t>-</w:t>
+            </w:r>
             <w:r>
               <w:rPr>
                 <w:rFonts w:ascii="Calibri" w:hAnsi="Calibri" w:eastAsia="Calibri"/>
@@ -1614,7 +1619,6 @@
                 <w:color w:val="222222"/>
                 <w:sz w:val="18"/>
               </w:rPr>
-              <w:t>—</w:t>
             </w:r>
           </w:p>
         </w:tc>

</xml_diff>

<commit_message>
Update brief issue date from Week 8 to Week 9
The brief is now issued in Week 9 (Wednesday 16 September 2026),
not Week 8. Updated the revised-issue paragraph and dates table.

Generated with [Devin](https://devin.ai)

Co-Authored-By: Devin <158243242+devin-ai-integration[bot]@users.noreply.github.com>
</commit_message>
<xml_diff>
--- a/practical_assignment/FR422_Assignment_Brief_Habitat_Conservation_Plan.docx
+++ b/practical_assignment/FR422_Assignment_Brief_Habitat_Conservation_Plan.docx
@@ -89,7 +89,7 @@
           <w:color w:val="222222"/>
           <w:sz w:val="20"/>
         </w:rPr>
-        <w:t>Revised issue: Week 8, Wednesday 9 September 2026. This brief replaces the unpublished Week 6 brief for this offering only. The approved lesson plan still lists the assignment as set in Week 6 and due in Week 12. That outline date is not the date for this submission. Use the date below.</w:t>
+        <w:t>Revised issue: Week 9, Wednesday 16 September 2026. This brief replaces the unpublished Week 6 brief for this offering only. The approved lesson plan still lists the assignment as set in Week 6 and due in Week 12. That outline date is not the date for this submission. Use the date below.</w:t>
       </w:r>
     </w:p>
     <w:p>
@@ -327,7 +327,9 @@
             </w:tcBorders>
           </w:tcPr>
           <w:p>
-            <w:r/>
+            <w:r>
+              <w:t>Wednesday 16 September 2026 (Week 9)</w:t>
+            </w:r>
             <w:r>
               <w:rPr>
                 <w:rFonts w:ascii="Calibri" w:hAnsi="Calibri" w:eastAsia="Calibri"/>
@@ -336,7 +338,6 @@
                 <w:color w:val="222222"/>
                 <w:sz w:val="18"/>
               </w:rPr>
-              <w:t>Wednesday 9 September 2026 (Week 8)</w:t>
             </w:r>
           </w:p>
         </w:tc>

</xml_diff>

<commit_message>
Simplify Part B: remove confusing clan/landowner/tenure complexity
The brief and example report were too complex for BSc4 students on
customary tenure, clan names, and landowner consent. Simplified:

Brief:
- Removed "clan or landowner name" from the do-not-invent rule
- Removed "clan or concession name" from what the file cannot support
- Rewrote the legal instrument bullet to simply name the three Acts
  and say clan consent is needed but the file does not record clan names
- Simplified monitoring and limitations bullets
- Renamed rubric row to "Instrument and monitoring" and simplified text

Example report:
- Rewrote section 7 in plain language explaining customary tenure
  simply: clans own the land, file has no clan names, consent needed

Guide:
- Removed "clan names" from the checklist

Generated with [Devin](https://devin.ai)

Co-Authored-By: Devin <158243242+devin-ai-integration[bot]@users.noreply.github.com>
</commit_message>
<xml_diff>
--- a/practical_assignment/FR422_Assignment_Brief_Habitat_Conservation_Plan.docx
+++ b/practical_assignment/FR422_Assignment_Brief_Habitat_Conservation_Plan.docx
@@ -184,7 +184,7 @@
           <w:color w:val="222222"/>
           <w:sz w:val="22"/>
         </w:rPr>
-        <w:t>•  Do not invent an IUCN category, a clan or landowner name, or a hectare figure. If a number is not on a cited page or printed by the software from your issued file, do not write it.</w:t>
+        <w:t>•  Do not invent an IUCN category or a hectare figure. If a number is not on a cited page or printed by the software from your issued file, do not write it.</w:t>
       </w:r>
     </w:p>
     <w:p>
@@ -1890,7 +1890,7 @@
           <w:color w:val="222222"/>
           <w:sz w:val="22"/>
         </w:rPr>
-        <w:t>•  A national land-cover classification, an IUCN range map, or a clan or concession name.</w:t>
+        <w:t>•  A national land-cover classification or an IUCN range map.</w:t>
       </w:r>
     </w:p>
     <w:p>
@@ -1982,7 +1982,7 @@
           <w:color w:val="222222"/>
           <w:sz w:val="22"/>
         </w:rPr>
-        <w:t>•  Two or three spatially explicit actions inside your issued-file hull extent. Name the sites, the elevation band, or the hot or cold cluster the action applies to. Do not name a clan, a concession, or a hectare target you did not calculate.</w:t>
+        <w:t>•  Two or three conservation actions inside your hull extent. Name the sites, the elevation band, or the hot or cold cluster each action applies to.</w:t>
       </w:r>
     </w:p>
     <w:p>
@@ -1998,7 +1998,7 @@
           <w:color w:val="222222"/>
           <w:sz w:val="22"/>
         </w:rPr>
-        <w:t>•  The legal instrument that fits the threat, and why. Customary tenure as a planning constraint. Do not invent a landowner. If the issued file does not record tenure, say the plan cannot assign an owner.</w:t>
+        <w:t>•  The legal instrument that fits the threat: a Wildlife Management Area (Fauna (Protection and Control) Act 1966), a Conservation Area (Conservation Areas Act 1978), or a protected area (Protected Areas Act 2023). Name the Act. Say that land in PNG is held under customary tenure, so any action needs clan consent, but your file does not record clan names so you cannot name them.</w:t>
       </w:r>
     </w:p>
     <w:p>
@@ -2014,7 +2014,7 @@
           <w:color w:val="222222"/>
           <w:sz w:val="22"/>
         </w:rPr>
-        <w:t>•  Monitoring: what you would remeasure, where, and how you would know the action had failed. Presence of your approved species is a monitoring target only if you say it is not in the lab file.</w:t>
+        <w:t>•  Monitoring: what you would remeasure, where, and how you would know the action had failed.</w:t>
       </w:r>
     </w:p>
     <w:p>
@@ -2030,7 +2030,7 @@
           <w:color w:val="222222"/>
           <w:sz w:val="22"/>
         </w:rPr>
-        <w:t>•  Limitations: GBIF teaching extract, not a census, stacked coordinates, no forest-change layer, no protected-area layer, n=128 (56 unique sites), and no area calculated in EPSG:4326.</w:t>
+        <w:t>•  Limitations: GBIF teaching extract, not a census, stacked coordinates, no forest-change layer, and no area calculated in EPSG:4326.</w:t>
       </w:r>
     </w:p>
     <w:p>
@@ -3224,7 +3224,9 @@
             </w:tcBorders>
           </w:tcPr>
           <w:p>
-            <w:r/>
+            <w:r>
+              <w:t>Two or three actions, each tied to named sites, an elevation band, or a cluster. Feasible.</w:t>
+            </w:r>
             <w:r>
               <w:rPr>
                 <w:rFonts w:ascii="Calibri" w:hAnsi="Calibri" w:eastAsia="Calibri"/>
@@ -3233,7 +3235,6 @@
                 <w:color w:val="222222"/>
                 <w:sz w:val="18"/>
               </w:rPr>
-              <w:t>Two or three actions, each tied to named sites, an elevation band, or a cluster. Feasible. No invented owners or hectare targets.</w:t>
             </w:r>
           </w:p>
         </w:tc>
@@ -3299,7 +3300,9 @@
             </w:tcBorders>
           </w:tcPr>
           <w:p>
-            <w:r/>
+            <w:r>
+              <w:t>Generic actions, or actions that invent a place or a number.</w:t>
+            </w:r>
             <w:r>
               <w:rPr>
                 <w:rFonts w:ascii="Calibri" w:hAnsi="Calibri" w:eastAsia="Calibri"/>
@@ -3308,7 +3311,6 @@
                 <w:color w:val="222222"/>
                 <w:sz w:val="18"/>
               </w:rPr>
-              <w:t>Generic actions, or actions that invent a place or a number.</w:t>
             </w:r>
           </w:p>
         </w:tc>
@@ -3325,7 +3327,9 @@
             </w:tcBorders>
           </w:tcPr>
           <w:p>
-            <w:r/>
+            <w:r>
+              <w:t>Instrument and monitoring (10)</w:t>
+            </w:r>
             <w:r>
               <w:rPr>
                 <w:rFonts w:ascii="Calibri" w:hAnsi="Calibri" w:eastAsia="Calibri"/>
@@ -3334,7 +3338,6 @@
                 <w:color w:val="222222"/>
                 <w:sz w:val="18"/>
               </w:rPr>
-              <w:t>Instrument, tenure, monitoring (10)</w:t>
             </w:r>
           </w:p>
         </w:tc>
@@ -3349,7 +3352,9 @@
             </w:tcBorders>
           </w:tcPr>
           <w:p>
-            <w:r/>
+            <w:r>
+              <w:t>The instrument matches the threat and the Act is named. Says clan consent is needed because land in PNG is customary. Monitoring says what, where, and how to know it failed.</w:t>
+            </w:r>
             <w:r>
               <w:rPr>
                 <w:rFonts w:ascii="Calibri" w:hAnsi="Calibri" w:eastAsia="Calibri"/>
@@ -3358,7 +3363,6 @@
                 <w:color w:val="222222"/>
                 <w:sz w:val="18"/>
               </w:rPr>
-              <w:t>The instrument matches the threat and the Act is named. Tenure is treated as unknown where the file is silent. Monitoring says what, where, and failure.</w:t>
             </w:r>
           </w:p>
         </w:tc>
@@ -3373,7 +3377,9 @@
             </w:tcBorders>
           </w:tcPr>
           <w:p>
-            <w:r/>
+            <w:r>
+              <w:t>Instrument and monitoring sound. Tenure mentioned.</w:t>
+            </w:r>
             <w:r>
               <w:rPr>
                 <w:rFonts w:ascii="Calibri" w:hAnsi="Calibri" w:eastAsia="Calibri"/>
@@ -3382,7 +3388,6 @@
                 <w:color w:val="222222"/>
                 <w:sz w:val="18"/>
               </w:rPr>
-              <w:t>Instrument and monitoring sound. Tenure handled with a small gap.</w:t>
             </w:r>
           </w:p>
         </w:tc>
@@ -3397,7 +3402,9 @@
             </w:tcBorders>
           </w:tcPr>
           <w:p>
-            <w:r/>
+            <w:r>
+              <w:t>Instrument named but poorly matched, or monitoring vague.</w:t>
+            </w:r>
             <w:r>
               <w:rPr>
                 <w:rFonts w:ascii="Calibri" w:hAnsi="Calibri" w:eastAsia="Calibri"/>
@@ -3406,7 +3413,6 @@
                 <w:color w:val="222222"/>
                 <w:sz w:val="18"/>
               </w:rPr>
-              <w:t>Instrument named but poorly matched, or monitoring vague.</w:t>
             </w:r>
           </w:p>
         </w:tc>
@@ -3421,7 +3427,9 @@
             </w:tcBorders>
           </w:tcPr>
           <w:p>
-            <w:r/>
+            <w:r>
+              <w:t>No instrument or no monitoring.</w:t>
+            </w:r>
             <w:r>
               <w:rPr>
                 <w:rFonts w:ascii="Calibri" w:hAnsi="Calibri" w:eastAsia="Calibri"/>
@@ -3430,7 +3438,6 @@
                 <w:color w:val="222222"/>
                 <w:sz w:val="18"/>
               </w:rPr>
-              <w:t>No instrument, invented tenure, or no monitoring.</w:t>
             </w:r>
           </w:p>
         </w:tc>

</xml_diff>

<commit_message>
Simplify Part B: reduce to 1,000-1,500 words, concise desk-based report
Emphasises practical GIS skills over long report writing. The report
is now a short, concise document that reports map results, ranks
threats, proposes actions, names the legal instrument, states
monitoring and limitations.

Brief:
- Word count reduced from 2,000-2,500 to 1,000-1,500
- All Part B bullets shortened to one line each
- Rubric simplified to match

Example report:
- Rewritten to 1,041 words (6 sections, not 9)
- Same structure, same figures, same data
- Concise throughout: report what the maps show, rank threats,
  propose actions, state limitations

Generated with [Devin](https://devin.ai)

Co-Authored-By: Devin <158243242+devin-ai-integration[bot]@users.noreply.github.com>
</commit_message>
<xml_diff>
--- a/practical_assignment/FR422_Assignment_Brief_Habitat_Conservation_Plan.docx
+++ b/practical_assignment/FR422_Assignment_Brief_Habitat_Conservation_Plan.docx
@@ -1950,7 +1950,7 @@
           <w:color w:val="222222"/>
           <w:sz w:val="22"/>
         </w:rPr>
-        <w:t>Body 2,000 to 2,500 words, excluding the reference list, tables, and map captions. This is a desk-based plan written from your five maps, the GeoSpaX statistics, and cited literature. You do not need to visit the sites or talk to communities. Statistical outputs printed by GeoSpaX (descriptive statistics, Gi* or LISA class counts, habitat-score summary, protection-gap figures) go in the report body, not as separate files.</w:t>
+        <w:t>Body 1,000 to 1,500 words, excluding the reference list, tables, and map captions. This is a short desk-based report written from your five maps and the GeoSpaX statistics. You do not need to visit the sites. Keep it concise: report what the maps show, rank the threats, propose actions, and state the limitations. Statistical outputs from GeoSpaX go in the report body.</w:t>
       </w:r>
     </w:p>
     <w:p>
@@ -1966,7 +1966,7 @@
           <w:color w:val="222222"/>
           <w:sz w:val="22"/>
         </w:rPr>
-        <w:t>•  Threats to your species, ranked from most to least important. Find them in the literature (IUCN species account, BirdLife, published papers). Link each threat to a map where possible: for example, if your Gi* map shows a hot-spot block of high tree cover, logging is a threat to that block. If the link is from literature rather than your maps, say so.</w:t>
+        <w:t>•  Threats: rank two or three threats from the literature (IUCN, BirdLife, published papers). Link each to a map if you can.</w:t>
       </w:r>
     </w:p>
     <w:p>
@@ -1982,7 +1982,7 @@
           <w:color w:val="222222"/>
           <w:sz w:val="22"/>
         </w:rPr>
-        <w:t>•  Two or three conservation actions based on what your maps show. For example: protect the hot-spot block from Map 3, restore the cold-spot cluster from Map 3, or protect the priority sites from Map 5. Name the geographic area on the map (the hot-spot block, the cold-spot cluster, the priority points) and the elevation band. You are proposing what should be done, not doing fieldwork.</w:t>
+        <w:t>•  Actions: propose two or three actions based on what your maps show (for example, protect the hot-spot block, restore the cold-spot cluster, protect priority sites from Map 5). Name the area on the map.</w:t>
       </w:r>
     </w:p>
     <w:p>
@@ -1998,7 +1998,7 @@
           <w:color w:val="222222"/>
           <w:sz w:val="22"/>
         </w:rPr>
-        <w:t>•  Name the legal instrument for each action: a Wildlife Management Area (Fauna (Protection and Control) Act 1966), a Conservation Area (Conservation Areas Act 1978), or a protected area (Protected Areas Act 2023). One sentence on why it fits. Note that land in PNG is under customary tenure, so any action would need clan consent in practice.</w:t>
+        <w:t>•  Legal instrument: name the Act for each action (Fauna (Protection and Control) Act 1966, Conservation Areas Act 1978, or Protected Areas Act 2023). Note that land in PNG is under customary tenure, so clan consent would be needed in practice.</w:t>
       </w:r>
     </w:p>
     <w:p>
@@ -2014,7 +2014,7 @@
           <w:color w:val="222222"/>
           <w:sz w:val="22"/>
         </w:rPr>
-        <w:t>•  Monitoring: what you would remeasure using GeoSpaX if new data came in (for example, re-run Gi* on updated tree cover, re-run the gap analysis after new protected areas). Say what would tell you the action is failing (for example, hot-spot count dropping, protected proportion not improving).</w:t>
+        <w:t>•  Monitoring: what you would re-run in GeoSpaX if new data came in, and what result would tell you the action is failing.</w:t>
       </w:r>
     </w:p>
     <w:p>
@@ -2030,7 +2030,7 @@
           <w:color w:val="222222"/>
           <w:sz w:val="22"/>
         </w:rPr>
-        <w:t>•  Limitations: the data are a GBIF teaching extract, not a census. The file has stacked coordinates, no forest-change layer, and no field-verified data. The plan is desk-based, not a field assessment. State these honestly.</w:t>
+        <w:t>•  Limitations: GBIF teaching extract, not a census, no field data, desk-based plan. State these honestly.</w:t>
       </w:r>
     </w:p>
     <w:p>
@@ -3101,7 +3101,7 @@
           </w:tcPr>
           <w:p>
             <w:r>
-              <w:t>Ranked with a reason. Each threat linked to a map or a cited source. Says which is which.</w:t>
+              <w:t>Two or three threats ranked, each linked to a map or cited source.</w:t>
             </w:r>
             <w:r>
               <w:rPr>
@@ -3229,7 +3229,7 @@
           </w:tcPr>
           <w:p>
             <w:r>
-              <w:t>Two or three actions, each tied to something visible on the maps (hot-spot block, cold-spot cluster, priority points, elevation band).</w:t>
+              <w:t>Two or three actions, each tied to something visible on the maps.</w:t>
             </w:r>
             <w:r>
               <w:rPr>
@@ -3359,7 +3359,7 @@
           </w:tcPr>
           <w:p>
             <w:r>
-              <w:t>Names the Act for each action. Says clan consent is needed. Monitoring says what to remeasure in GeoSpaX and what failure looks like.</w:t>
+              <w:t>Names the Act for each action. Monitoring says what to re-run in GeoSpaX and what failure looks like.</w:t>
             </w:r>
             <w:r>
               <w:rPr>
@@ -3487,7 +3487,7 @@
           </w:tcPr>
           <w:p>
             <w:r>
-              <w:t>GBIF extract, not a census, stacked coordinates, no field data, and desk-based plan. These limits are stated and used to bound the plan.</w:t>
+              <w:t>GBIF extract, not a census, no field data, desk-based plan. Stated and used to bound the plan.</w:t>
             </w:r>
             <w:r>
               <w:rPr>
@@ -3615,7 +3615,9 @@
             </w:tcBorders>
           </w:tcPr>
           <w:p>
-            <w:r/>
+            <w:r>
+              <w:t>APA 7th consistent. Claims traceable. Concise writing.</w:t>
+            </w:r>
             <w:r>
               <w:rPr>
                 <w:rFonts w:ascii="Calibri" w:hAnsi="Calibri" w:eastAsia="Calibri"/>
@@ -3624,7 +3626,6 @@
                 <w:color w:val="222222"/>
                 <w:sz w:val="18"/>
               </w:rPr>
-              <w:t>APA 7th consistent. Claims traceable. Similarity consistent with original writing.</w:t>
             </w:r>
           </w:p>
         </w:tc>
@@ -3639,7 +3640,9 @@
             </w:tcBorders>
           </w:tcPr>
           <w:p>
-            <w:r/>
+            <w:r>
+              <w:t>Referencing sound, minor slips.</w:t>
+            </w:r>
             <w:r>
               <w:rPr>
                 <w:rFonts w:ascii="Calibri" w:hAnsi="Calibri" w:eastAsia="Calibri"/>
@@ -3648,7 +3651,6 @@
                 <w:color w:val="222222"/>
                 <w:sz w:val="18"/>
               </w:rPr>
-              <w:t>Referencing sound, minor slips.</w:t>
             </w:r>
           </w:p>
         </w:tc>
@@ -3663,7 +3665,9 @@
             </w:tcBorders>
           </w:tcPr>
           <w:p>
-            <w:r/>
+            <w:r>
+              <w:t>Some claims unsupported, or referencing uneven.</w:t>
+            </w:r>
             <w:r>
               <w:rPr>
                 <w:rFonts w:ascii="Calibri" w:hAnsi="Calibri" w:eastAsia="Calibri"/>
@@ -3672,7 +3676,6 @@
                 <w:color w:val="222222"/>
                 <w:sz w:val="18"/>
               </w:rPr>
-              <w:t>Some claims unsupported, or referencing uneven.</w:t>
             </w:r>
           </w:p>
         </w:tc>
@@ -3687,7 +3690,9 @@
             </w:tcBorders>
           </w:tcPr>
           <w:p>
-            <w:r/>
+            <w:r>
+              <w:t>Unsupported claims, or the writing is not the student's.</w:t>
+            </w:r>
             <w:r>
               <w:rPr>
                 <w:rFonts w:ascii="Calibri" w:hAnsi="Calibri" w:eastAsia="Calibri"/>
@@ -3696,7 +3701,6 @@
                 <w:color w:val="222222"/>
                 <w:sz w:val="18"/>
               </w:rPr>
-              <w:t>Unsupported claims, or the writing is not the student's.</w:t>
             </w:r>
           </w:p>
         </w:tc>

</xml_diff>

<commit_message>
Add 'How to write this report' guidance for students
Researched IUCN, Open Standards, and university conservation report
guides. Added a plain-language writing guide to both the brief and
the example report so students know exactly what to do:

- Write in full sentences, one idea per paragraph
- Use active voice ("I propose", "The map shows")
- Keep it simple and direct
- Each of the six sections does one job (explained in the brief)
- Example report shows the structure and length to follow

Generated with [Devin](https://devin.ai)

Co-Authored-By: Devin <158243242+devin-ai-integration[bot]@users.noreply.github.com>
</commit_message>
<xml_diff>
--- a/practical_assignment/FR422_Assignment_Brief_Habitat_Conservation_Plan.docx
+++ b/practical_assignment/FR422_Assignment_Brief_Habitat_Conservation_Plan.docx
@@ -1951,6 +1951,15 @@
           <w:sz w:val="22"/>
         </w:rPr>
         <w:t>Body 800 to 1,000 words, excluding the reference list, tables, and map captions. Put your full name and student ID number at the top of the report. This is a short desk-based report written from your five maps and the GeoSpaX statistics. Write in full sentences. Keep it concise: report what the maps show, rank the threats, propose actions, and state the limitations. Statistical outputs from GeoSpaX go in the report body.</w:t>
+      </w:r>
+    </w:p>
+    <w:p>
+      <w:pPr>
+        <w:spacing w:before="0" w:after="60" w:line="252" w:lineRule="auto"/>
+        <w:ind w:left="425" w:hanging="198"/>
+      </w:pPr>
+      <w:r>
+        <w:t>How to write this report: Write in full sentences, one idea per paragraph. Use active voice ("I propose", "The map shows"). Keep it simple and direct. The report has six sections. Section 1 introduces the species and study area. Section 2 reports what each of your five maps shows, with the GeoSpaX statistics. Section 3 ranks two or three threats from the literature and links them to your maps. Section 4 proposes two or three conservation actions based on what the maps show, and names the legal Act for each. Section 5 says what you would re-run in GeoSpaX to monitor, and what failure looks like. Section 6 states the limitations honestly. The example report on Google Classroom shows the structure and length to follow.</w:t>
       </w:r>
     </w:p>
     <w:p>

</xml_diff>

<commit_message>
Add full species list table to assignment brief
Embedded the 24-species list directly in the brief (section 4, after
"Choose one species") so students can see all options without opening
a separate Excel file. Table includes scientific name, common name,
group, record count, unique sites, Map 3 type (standard/exploratory),
and notes.

Generated with [Devin](https://devin.ai)

Co-Authored-By: Devin <158243242+devin-ai-integration[bot]@users.noreply.github.com>
</commit_message>
<xml_diff>
--- a/practical_assignment/FR422_Assignment_Brief_Habitat_Conservation_Plan.docx
+++ b/practical_assignment/FR422_Assignment_Brief_Habitat_Conservation_Plan.docx
@@ -1660,6 +1660,3311 @@
         <w:t>Choose one species from the FR422 assignment species list (Excel). The lecturer confirms your choice and sends you that species geojson. No two students take the same species. Look up the IUCN category on the Red List and cite the account, including the date you checked it. Do not start the five marked maps until you have your issued file.</w:t>
       </w:r>
     </w:p>
+    <w:tbl>
+      <w:tblPr>
+        <w:tblW w:w="0" w:type="auto"/>
+        <w:tblBorders>
+          <w:top w:val="single" w:sz="4" w:space="0" w:color="auto"/>
+          <w:left w:val="single" w:sz="4" w:space="0" w:color="auto"/>
+          <w:bottom w:val="single" w:sz="4" w:space="0" w:color="auto"/>
+          <w:right w:val="single" w:sz="4" w:space="0" w:color="auto"/>
+          <w:insideH w:val="single" w:sz="4" w:space="0" w:color="auto"/>
+          <w:insideV w:val="single" w:sz="4" w:space="0" w:color="auto"/>
+        </w:tblBorders>
+      </w:tblPr>
+      <w:tblGrid>
+        <w:gridCol w:w="500"/>
+        <w:gridCol w:w="2200"/>
+        <w:gridCol w:w="2000"/>
+        <w:gridCol w:w="900"/>
+        <w:gridCol w:w="900"/>
+        <w:gridCol w:w="1000"/>
+        <w:gridCol w:w="1000"/>
+        <w:gridCol w:w="1800"/>
+      </w:tblGrid>
+      <w:tr>
+        <w:tc>
+          <w:tcPr>
+            <w:tcW w:w="500" w:type="dxa"/>
+          </w:tcPr>
+          <w:p>
+            <w:pPr>
+              <w:spacing w:before="20" w:after="20"/>
+            </w:pPr>
+            <w:r>
+              <w:rPr>
+                <w:sz w:val="16"/>
+                <w:b/>
+              </w:rPr>
+              <w:t xml:space="preserve">No.</w:t>
+            </w:r>
+          </w:p>
+        </w:tc>
+        <w:tc>
+          <w:tcPr>
+            <w:tcW w:w="2200" w:type="dxa"/>
+          </w:tcPr>
+          <w:p>
+            <w:pPr>
+              <w:spacing w:before="20" w:after="20"/>
+            </w:pPr>
+            <w:r>
+              <w:rPr>
+                <w:sz w:val="16"/>
+                <w:b/>
+              </w:rPr>
+              <w:t xml:space="preserve">Scientific name</w:t>
+            </w:r>
+          </w:p>
+        </w:tc>
+        <w:tc>
+          <w:tcPr>
+            <w:tcW w:w="2000" w:type="dxa"/>
+          </w:tcPr>
+          <w:p>
+            <w:pPr>
+              <w:spacing w:before="20" w:after="20"/>
+            </w:pPr>
+            <w:r>
+              <w:rPr>
+                <w:sz w:val="16"/>
+                <w:b/>
+              </w:rPr>
+              <w:t xml:space="preserve">Common name</w:t>
+            </w:r>
+          </w:p>
+        </w:tc>
+        <w:tc>
+          <w:tcPr>
+            <w:tcW w:w="900" w:type="dxa"/>
+          </w:tcPr>
+          <w:p>
+            <w:pPr>
+              <w:spacing w:before="20" w:after="20"/>
+            </w:pPr>
+            <w:r>
+              <w:rPr>
+                <w:sz w:val="16"/>
+                <w:b/>
+              </w:rPr>
+              <w:t xml:space="preserve">Group</w:t>
+            </w:r>
+          </w:p>
+        </w:tc>
+        <w:tc>
+          <w:tcPr>
+            <w:tcW w:w="900" w:type="dxa"/>
+          </w:tcPr>
+          <w:p>
+            <w:pPr>
+              <w:spacing w:before="20" w:after="20"/>
+            </w:pPr>
+            <w:r>
+              <w:rPr>
+                <w:sz w:val="16"/>
+                <w:b/>
+              </w:rPr>
+              <w:t xml:space="preserve">Records (n)</w:t>
+            </w:r>
+          </w:p>
+        </w:tc>
+        <w:tc>
+          <w:tcPr>
+            <w:tcW w:w="1000" w:type="dxa"/>
+          </w:tcPr>
+          <w:p>
+            <w:pPr>
+              <w:spacing w:before="20" w:after="20"/>
+            </w:pPr>
+            <w:r>
+              <w:rPr>
+                <w:sz w:val="16"/>
+                <w:b/>
+              </w:rPr>
+              <w:t xml:space="preserve">Unique sites</w:t>
+            </w:r>
+          </w:p>
+        </w:tc>
+        <w:tc>
+          <w:tcPr>
+            <w:tcW w:w="1000" w:type="dxa"/>
+          </w:tcPr>
+          <w:p>
+            <w:pPr>
+              <w:spacing w:before="20" w:after="20"/>
+            </w:pPr>
+            <w:r>
+              <w:rPr>
+                <w:sz w:val="16"/>
+                <w:b/>
+              </w:rPr>
+              <w:t xml:space="preserve">Map 3</w:t>
+            </w:r>
+          </w:p>
+        </w:tc>
+        <w:tc>
+          <w:tcPr>
+            <w:tcW w:w="1800" w:type="dxa"/>
+          </w:tcPr>
+          <w:p>
+            <w:pPr>
+              <w:spacing w:before="20" w:after="20"/>
+            </w:pPr>
+            <w:r>
+              <w:rPr>
+                <w:sz w:val="16"/>
+                <w:b/>
+              </w:rPr>
+              <w:t xml:space="preserve">Note</w:t>
+            </w:r>
+          </w:p>
+        </w:tc>
+      </w:tr>
+      <w:tr>
+        <w:tc>
+          <w:tcPr>
+            <w:tcW w:w="500" w:type="dxa"/>
+          </w:tcPr>
+          <w:p>
+            <w:pPr>
+              <w:spacing w:before="20" w:after="20"/>
+            </w:pPr>
+            <w:r>
+              <w:rPr>
+                <w:sz w:val="16"/>
+              </w:rPr>
+              <w:t xml:space="preserve">01</w:t>
+            </w:r>
+          </w:p>
+        </w:tc>
+        <w:tc>
+          <w:tcPr>
+            <w:tcW w:w="2200" w:type="dxa"/>
+          </w:tcPr>
+          <w:p>
+            <w:pPr>
+              <w:spacing w:before="20" w:after="20"/>
+            </w:pPr>
+            <w:r>
+              <w:rPr>
+                <w:sz w:val="16"/>
+                <w:i/>
+              </w:rPr>
+              <w:t xml:space="preserve">Echymipera kalubu</w:t>
+            </w:r>
+          </w:p>
+        </w:tc>
+        <w:tc>
+          <w:tcPr>
+            <w:tcW w:w="2000" w:type="dxa"/>
+          </w:tcPr>
+          <w:p>
+            <w:pPr>
+              <w:spacing w:before="20" w:after="20"/>
+            </w:pPr>
+            <w:r>
+              <w:rPr>
+                <w:sz w:val="16"/>
+              </w:rPr>
+              <w:t xml:space="preserve">Common Spiny Bandicoot</w:t>
+            </w:r>
+          </w:p>
+        </w:tc>
+        <w:tc>
+          <w:tcPr>
+            <w:tcW w:w="900" w:type="dxa"/>
+          </w:tcPr>
+          <w:p>
+            <w:pPr>
+              <w:spacing w:before="20" w:after="20"/>
+            </w:pPr>
+            <w:r>
+              <w:rPr>
+                <w:sz w:val="16"/>
+              </w:rPr>
+              <w:t xml:space="preserve">Mammal</w:t>
+            </w:r>
+          </w:p>
+        </w:tc>
+        <w:tc>
+          <w:tcPr>
+            <w:tcW w:w="900" w:type="dxa"/>
+          </w:tcPr>
+          <w:p>
+            <w:pPr>
+              <w:spacing w:before="20" w:after="20"/>
+            </w:pPr>
+            <w:r>
+              <w:rPr>
+                <w:sz w:val="16"/>
+              </w:rPr>
+              <w:t xml:space="preserve">88</w:t>
+            </w:r>
+          </w:p>
+        </w:tc>
+        <w:tc>
+          <w:tcPr>
+            <w:tcW w:w="1000" w:type="dxa"/>
+          </w:tcPr>
+          <w:p>
+            <w:pPr>
+              <w:spacing w:before="20" w:after="20"/>
+            </w:pPr>
+            <w:r>
+              <w:rPr>
+                <w:sz w:val="16"/>
+              </w:rPr>
+              <w:t xml:space="preserve">40</w:t>
+            </w:r>
+          </w:p>
+        </w:tc>
+        <w:tc>
+          <w:tcPr>
+            <w:tcW w:w="1000" w:type="dxa"/>
+          </w:tcPr>
+          <w:p>
+            <w:pPr>
+              <w:spacing w:before="20" w:after="20"/>
+            </w:pPr>
+            <w:r>
+              <w:rPr>
+                <w:sz w:val="16"/>
+              </w:rPr>
+              <w:t xml:space="preserve">Standard</w:t>
+            </w:r>
+          </w:p>
+        </w:tc>
+        <w:tc>
+          <w:tcPr>
+            <w:tcW w:w="1800" w:type="dxa"/>
+          </w:tcPr>
+          <w:p>
+            <w:pPr>
+              <w:spacing w:before="20" w:after="20"/>
+            </w:pPr>
+            <w:r>
+              <w:rPr>
+                <w:sz w:val="16"/>
+              </w:rPr>
+              <w:t xml:space="preserve"/>
+            </w:r>
+          </w:p>
+        </w:tc>
+      </w:tr>
+      <w:tr>
+        <w:tc>
+          <w:tcPr>
+            <w:tcW w:w="500" w:type="dxa"/>
+          </w:tcPr>
+          <w:p>
+            <w:pPr>
+              <w:spacing w:before="20" w:after="20"/>
+            </w:pPr>
+            <w:r>
+              <w:rPr>
+                <w:sz w:val="16"/>
+              </w:rPr>
+              <w:t xml:space="preserve">02</w:t>
+            </w:r>
+          </w:p>
+        </w:tc>
+        <w:tc>
+          <w:tcPr>
+            <w:tcW w:w="2200" w:type="dxa"/>
+          </w:tcPr>
+          <w:p>
+            <w:pPr>
+              <w:spacing w:before="20" w:after="20"/>
+            </w:pPr>
+            <w:r>
+              <w:rPr>
+                <w:sz w:val="16"/>
+                <w:i/>
+              </w:rPr>
+              <w:t xml:space="preserve">Echymipera rufescens</w:t>
+            </w:r>
+          </w:p>
+        </w:tc>
+        <w:tc>
+          <w:tcPr>
+            <w:tcW w:w="2000" w:type="dxa"/>
+          </w:tcPr>
+          <w:p>
+            <w:pPr>
+              <w:spacing w:before="20" w:after="20"/>
+            </w:pPr>
+            <w:r>
+              <w:rPr>
+                <w:sz w:val="16"/>
+              </w:rPr>
+              <w:t xml:space="preserve">Long-nosed Spiny Bandicoot</w:t>
+            </w:r>
+          </w:p>
+        </w:tc>
+        <w:tc>
+          <w:tcPr>
+            <w:tcW w:w="900" w:type="dxa"/>
+          </w:tcPr>
+          <w:p>
+            <w:pPr>
+              <w:spacing w:before="20" w:after="20"/>
+            </w:pPr>
+            <w:r>
+              <w:rPr>
+                <w:sz w:val="16"/>
+              </w:rPr>
+              <w:t xml:space="preserve">Mammal</w:t>
+            </w:r>
+          </w:p>
+        </w:tc>
+        <w:tc>
+          <w:tcPr>
+            <w:tcW w:w="900" w:type="dxa"/>
+          </w:tcPr>
+          <w:p>
+            <w:pPr>
+              <w:spacing w:before="20" w:after="20"/>
+            </w:pPr>
+            <w:r>
+              <w:rPr>
+                <w:sz w:val="16"/>
+              </w:rPr>
+              <w:t xml:space="preserve">74</w:t>
+            </w:r>
+          </w:p>
+        </w:tc>
+        <w:tc>
+          <w:tcPr>
+            <w:tcW w:w="1000" w:type="dxa"/>
+          </w:tcPr>
+          <w:p>
+            <w:pPr>
+              <w:spacing w:before="20" w:after="20"/>
+            </w:pPr>
+            <w:r>
+              <w:rPr>
+                <w:sz w:val="16"/>
+              </w:rPr>
+              <w:t xml:space="preserve">27</w:t>
+            </w:r>
+          </w:p>
+        </w:tc>
+        <w:tc>
+          <w:tcPr>
+            <w:tcW w:w="1000" w:type="dxa"/>
+          </w:tcPr>
+          <w:p>
+            <w:pPr>
+              <w:spacing w:before="20" w:after="20"/>
+            </w:pPr>
+            <w:r>
+              <w:rPr>
+                <w:sz w:val="16"/>
+              </w:rPr>
+              <w:t xml:space="preserve">Exploratory</w:t>
+            </w:r>
+          </w:p>
+        </w:tc>
+        <w:tc>
+          <w:tcPr>
+            <w:tcW w:w="1800" w:type="dxa"/>
+          </w:tcPr>
+          <w:p>
+            <w:pPr>
+              <w:spacing w:before="20" w:after="20"/>
+            </w:pPr>
+            <w:r>
+              <w:rPr>
+                <w:sz w:val="16"/>
+              </w:rPr>
+              <w:t xml:space="preserve">Map 3 exploratory (unique sites below 30)</w:t>
+            </w:r>
+          </w:p>
+        </w:tc>
+      </w:tr>
+      <w:tr>
+        <w:tc>
+          <w:tcPr>
+            <w:tcW w:w="500" w:type="dxa"/>
+          </w:tcPr>
+          <w:p>
+            <w:pPr>
+              <w:spacing w:before="20" w:after="20"/>
+            </w:pPr>
+            <w:r>
+              <w:rPr>
+                <w:sz w:val="16"/>
+              </w:rPr>
+              <w:t xml:space="preserve">03</w:t>
+            </w:r>
+          </w:p>
+        </w:tc>
+        <w:tc>
+          <w:tcPr>
+            <w:tcW w:w="2200" w:type="dxa"/>
+          </w:tcPr>
+          <w:p>
+            <w:pPr>
+              <w:spacing w:before="20" w:after="20"/>
+            </w:pPr>
+            <w:r>
+              <w:rPr>
+                <w:sz w:val="16"/>
+                <w:i/>
+              </w:rPr>
+              <w:t xml:space="preserve">Casuarius bennetti</w:t>
+            </w:r>
+          </w:p>
+        </w:tc>
+        <w:tc>
+          <w:tcPr>
+            <w:tcW w:w="2000" w:type="dxa"/>
+          </w:tcPr>
+          <w:p>
+            <w:pPr>
+              <w:spacing w:before="20" w:after="20"/>
+            </w:pPr>
+            <w:r>
+              <w:rPr>
+                <w:sz w:val="16"/>
+              </w:rPr>
+              <w:t xml:space="preserve">Dwarf Cassowary</w:t>
+            </w:r>
+          </w:p>
+        </w:tc>
+        <w:tc>
+          <w:tcPr>
+            <w:tcW w:w="900" w:type="dxa"/>
+          </w:tcPr>
+          <w:p>
+            <w:pPr>
+              <w:spacing w:before="20" w:after="20"/>
+            </w:pPr>
+            <w:r>
+              <w:rPr>
+                <w:sz w:val="16"/>
+              </w:rPr>
+              <w:t xml:space="preserve">Bird</w:t>
+            </w:r>
+          </w:p>
+        </w:tc>
+        <w:tc>
+          <w:tcPr>
+            <w:tcW w:w="900" w:type="dxa"/>
+          </w:tcPr>
+          <w:p>
+            <w:pPr>
+              <w:spacing w:before="20" w:after="20"/>
+            </w:pPr>
+            <w:r>
+              <w:rPr>
+                <w:sz w:val="16"/>
+              </w:rPr>
+              <w:t xml:space="preserve">128</w:t>
+            </w:r>
+          </w:p>
+        </w:tc>
+        <w:tc>
+          <w:tcPr>
+            <w:tcW w:w="1000" w:type="dxa"/>
+          </w:tcPr>
+          <w:p>
+            <w:pPr>
+              <w:spacing w:before="20" w:after="20"/>
+            </w:pPr>
+            <w:r>
+              <w:rPr>
+                <w:sz w:val="16"/>
+              </w:rPr>
+              <w:t xml:space="preserve">67</w:t>
+            </w:r>
+          </w:p>
+        </w:tc>
+        <w:tc>
+          <w:tcPr>
+            <w:tcW w:w="1000" w:type="dxa"/>
+          </w:tcPr>
+          <w:p>
+            <w:pPr>
+              <w:spacing w:before="20" w:after="20"/>
+            </w:pPr>
+            <w:r>
+              <w:rPr>
+                <w:sz w:val="16"/>
+              </w:rPr>
+              <w:t xml:space="preserve">Standard</w:t>
+            </w:r>
+          </w:p>
+        </w:tc>
+        <w:tc>
+          <w:tcPr>
+            <w:tcW w:w="1800" w:type="dxa"/>
+          </w:tcPr>
+          <w:p>
+            <w:pPr>
+              <w:spacing w:before="20" w:after="20"/>
+            </w:pPr>
+            <w:r>
+              <w:rPr>
+                <w:sz w:val="16"/>
+              </w:rPr>
+              <w:t xml:space="preserve"/>
+            </w:r>
+          </w:p>
+        </w:tc>
+      </w:tr>
+      <w:tr>
+        <w:tc>
+          <w:tcPr>
+            <w:tcW w:w="500" w:type="dxa"/>
+          </w:tcPr>
+          <w:p>
+            <w:pPr>
+              <w:spacing w:before="20" w:after="20"/>
+            </w:pPr>
+            <w:r>
+              <w:rPr>
+                <w:sz w:val="16"/>
+              </w:rPr>
+              <w:t xml:space="preserve">04</w:t>
+            </w:r>
+          </w:p>
+        </w:tc>
+        <w:tc>
+          <w:tcPr>
+            <w:tcW w:w="2200" w:type="dxa"/>
+          </w:tcPr>
+          <w:p>
+            <w:pPr>
+              <w:spacing w:before="20" w:after="20"/>
+            </w:pPr>
+            <w:r>
+              <w:rPr>
+                <w:sz w:val="16"/>
+                <w:i/>
+              </w:rPr>
+              <w:t xml:space="preserve">Casuarius unappendiculatus</w:t>
+            </w:r>
+          </w:p>
+        </w:tc>
+        <w:tc>
+          <w:tcPr>
+            <w:tcW w:w="2000" w:type="dxa"/>
+          </w:tcPr>
+          <w:p>
+            <w:pPr>
+              <w:spacing w:before="20" w:after="20"/>
+            </w:pPr>
+            <w:r>
+              <w:rPr>
+                <w:sz w:val="16"/>
+              </w:rPr>
+              <w:t xml:space="preserve">Northern Cassowary</w:t>
+            </w:r>
+          </w:p>
+        </w:tc>
+        <w:tc>
+          <w:tcPr>
+            <w:tcW w:w="900" w:type="dxa"/>
+          </w:tcPr>
+          <w:p>
+            <w:pPr>
+              <w:spacing w:before="20" w:after="20"/>
+            </w:pPr>
+            <w:r>
+              <w:rPr>
+                <w:sz w:val="16"/>
+              </w:rPr>
+              <w:t xml:space="preserve">Bird</w:t>
+            </w:r>
+          </w:p>
+        </w:tc>
+        <w:tc>
+          <w:tcPr>
+            <w:tcW w:w="900" w:type="dxa"/>
+          </w:tcPr>
+          <w:p>
+            <w:pPr>
+              <w:spacing w:before="20" w:after="20"/>
+            </w:pPr>
+            <w:r>
+              <w:rPr>
+                <w:sz w:val="16"/>
+              </w:rPr>
+              <w:t xml:space="preserve">60</w:t>
+            </w:r>
+          </w:p>
+        </w:tc>
+        <w:tc>
+          <w:tcPr>
+            <w:tcW w:w="1000" w:type="dxa"/>
+          </w:tcPr>
+          <w:p>
+            <w:pPr>
+              <w:spacing w:before="20" w:after="20"/>
+            </w:pPr>
+            <w:r>
+              <w:rPr>
+                <w:sz w:val="16"/>
+              </w:rPr>
+              <w:t xml:space="preserve">30</w:t>
+            </w:r>
+          </w:p>
+        </w:tc>
+        <w:tc>
+          <w:tcPr>
+            <w:tcW w:w="1000" w:type="dxa"/>
+          </w:tcPr>
+          <w:p>
+            <w:pPr>
+              <w:spacing w:before="20" w:after="20"/>
+            </w:pPr>
+            <w:r>
+              <w:rPr>
+                <w:sz w:val="16"/>
+              </w:rPr>
+              <w:t xml:space="preserve">Standard</w:t>
+            </w:r>
+          </w:p>
+        </w:tc>
+        <w:tc>
+          <w:tcPr>
+            <w:tcW w:w="1800" w:type="dxa"/>
+          </w:tcPr>
+          <w:p>
+            <w:pPr>
+              <w:spacing w:before="20" w:after="20"/>
+            </w:pPr>
+            <w:r>
+              <w:rPr>
+                <w:sz w:val="16"/>
+              </w:rPr>
+              <w:t xml:space="preserve"/>
+            </w:r>
+          </w:p>
+        </w:tc>
+      </w:tr>
+      <w:tr>
+        <w:tc>
+          <w:tcPr>
+            <w:tcW w:w="500" w:type="dxa"/>
+          </w:tcPr>
+          <w:p>
+            <w:pPr>
+              <w:spacing w:before="20" w:after="20"/>
+            </w:pPr>
+            <w:r>
+              <w:rPr>
+                <w:sz w:val="16"/>
+              </w:rPr>
+              <w:t xml:space="preserve">05</w:t>
+            </w:r>
+          </w:p>
+        </w:tc>
+        <w:tc>
+          <w:tcPr>
+            <w:tcW w:w="2200" w:type="dxa"/>
+          </w:tcPr>
+          <w:p>
+            <w:pPr>
+              <w:spacing w:before="20" w:after="20"/>
+            </w:pPr>
+            <w:r>
+              <w:rPr>
+                <w:sz w:val="16"/>
+                <w:i/>
+              </w:rPr>
+              <w:t xml:space="preserve">Goura victoria</w:t>
+            </w:r>
+          </w:p>
+        </w:tc>
+        <w:tc>
+          <w:tcPr>
+            <w:tcW w:w="2000" w:type="dxa"/>
+          </w:tcPr>
+          <w:p>
+            <w:pPr>
+              <w:spacing w:before="20" w:after="20"/>
+            </w:pPr>
+            <w:r>
+              <w:rPr>
+                <w:sz w:val="16"/>
+              </w:rPr>
+              <w:t xml:space="preserve">Victoria Crowned Pigeon</w:t>
+            </w:r>
+          </w:p>
+        </w:tc>
+        <w:tc>
+          <w:tcPr>
+            <w:tcW w:w="900" w:type="dxa"/>
+          </w:tcPr>
+          <w:p>
+            <w:pPr>
+              <w:spacing w:before="20" w:after="20"/>
+            </w:pPr>
+            <w:r>
+              <w:rPr>
+                <w:sz w:val="16"/>
+              </w:rPr>
+              <w:t xml:space="preserve">Bird</w:t>
+            </w:r>
+          </w:p>
+        </w:tc>
+        <w:tc>
+          <w:tcPr>
+            <w:tcW w:w="900" w:type="dxa"/>
+          </w:tcPr>
+          <w:p>
+            <w:pPr>
+              <w:spacing w:before="20" w:after="20"/>
+            </w:pPr>
+            <w:r>
+              <w:rPr>
+                <w:sz w:val="16"/>
+              </w:rPr>
+              <w:t xml:space="preserve">112</w:t>
+            </w:r>
+          </w:p>
+        </w:tc>
+        <w:tc>
+          <w:tcPr>
+            <w:tcW w:w="1000" w:type="dxa"/>
+          </w:tcPr>
+          <w:p>
+            <w:pPr>
+              <w:spacing w:before="20" w:after="20"/>
+            </w:pPr>
+            <w:r>
+              <w:rPr>
+                <w:sz w:val="16"/>
+              </w:rPr>
+              <w:t xml:space="preserve">74</w:t>
+            </w:r>
+          </w:p>
+        </w:tc>
+        <w:tc>
+          <w:tcPr>
+            <w:tcW w:w="1000" w:type="dxa"/>
+          </w:tcPr>
+          <w:p>
+            <w:pPr>
+              <w:spacing w:before="20" w:after="20"/>
+            </w:pPr>
+            <w:r>
+              <w:rPr>
+                <w:sz w:val="16"/>
+              </w:rPr>
+              <w:t xml:space="preserve">Standard</w:t>
+            </w:r>
+          </w:p>
+        </w:tc>
+        <w:tc>
+          <w:tcPr>
+            <w:tcW w:w="1800" w:type="dxa"/>
+          </w:tcPr>
+          <w:p>
+            <w:pPr>
+              <w:spacing w:before="20" w:after="20"/>
+            </w:pPr>
+            <w:r>
+              <w:rPr>
+                <w:sz w:val="16"/>
+              </w:rPr>
+              <w:t xml:space="preserve"/>
+            </w:r>
+          </w:p>
+        </w:tc>
+      </w:tr>
+      <w:tr>
+        <w:tc>
+          <w:tcPr>
+            <w:tcW w:w="500" w:type="dxa"/>
+          </w:tcPr>
+          <w:p>
+            <w:pPr>
+              <w:spacing w:before="20" w:after="20"/>
+            </w:pPr>
+            <w:r>
+              <w:rPr>
+                <w:sz w:val="16"/>
+              </w:rPr>
+              <w:t xml:space="preserve">06</w:t>
+            </w:r>
+          </w:p>
+        </w:tc>
+        <w:tc>
+          <w:tcPr>
+            <w:tcW w:w="2200" w:type="dxa"/>
+          </w:tcPr>
+          <w:p>
+            <w:pPr>
+              <w:spacing w:before="20" w:after="20"/>
+            </w:pPr>
+            <w:r>
+              <w:rPr>
+                <w:sz w:val="16"/>
+                <w:i/>
+              </w:rPr>
+              <w:t xml:space="preserve">Psittrichas fulgidus</w:t>
+            </w:r>
+          </w:p>
+        </w:tc>
+        <w:tc>
+          <w:tcPr>
+            <w:tcW w:w="2000" w:type="dxa"/>
+          </w:tcPr>
+          <w:p>
+            <w:pPr>
+              <w:spacing w:before="20" w:after="20"/>
+            </w:pPr>
+            <w:r>
+              <w:rPr>
+                <w:sz w:val="16"/>
+              </w:rPr>
+              <w:t xml:space="preserve">Pesquet's Parrot</w:t>
+            </w:r>
+          </w:p>
+        </w:tc>
+        <w:tc>
+          <w:tcPr>
+            <w:tcW w:w="900" w:type="dxa"/>
+          </w:tcPr>
+          <w:p>
+            <w:pPr>
+              <w:spacing w:before="20" w:after="20"/>
+            </w:pPr>
+            <w:r>
+              <w:rPr>
+                <w:sz w:val="16"/>
+              </w:rPr>
+              <w:t xml:space="preserve">Bird</w:t>
+            </w:r>
+          </w:p>
+        </w:tc>
+        <w:tc>
+          <w:tcPr>
+            <w:tcW w:w="900" w:type="dxa"/>
+          </w:tcPr>
+          <w:p>
+            <w:pPr>
+              <w:spacing w:before="20" w:after="20"/>
+            </w:pPr>
+            <w:r>
+              <w:rPr>
+                <w:sz w:val="16"/>
+              </w:rPr>
+              <w:t xml:space="preserve">928</w:t>
+            </w:r>
+          </w:p>
+        </w:tc>
+        <w:tc>
+          <w:tcPr>
+            <w:tcW w:w="1000" w:type="dxa"/>
+          </w:tcPr>
+          <w:p>
+            <w:pPr>
+              <w:spacing w:before="20" w:after="20"/>
+            </w:pPr>
+            <w:r>
+              <w:rPr>
+                <w:sz w:val="16"/>
+              </w:rPr>
+              <w:t xml:space="preserve">255</w:t>
+            </w:r>
+          </w:p>
+        </w:tc>
+        <w:tc>
+          <w:tcPr>
+            <w:tcW w:w="1000" w:type="dxa"/>
+          </w:tcPr>
+          <w:p>
+            <w:pPr>
+              <w:spacing w:before="20" w:after="20"/>
+            </w:pPr>
+            <w:r>
+              <w:rPr>
+                <w:sz w:val="16"/>
+              </w:rPr>
+              <w:t xml:space="preserve">Standard</w:t>
+            </w:r>
+          </w:p>
+        </w:tc>
+        <w:tc>
+          <w:tcPr>
+            <w:tcW w:w="1800" w:type="dxa"/>
+          </w:tcPr>
+          <w:p>
+            <w:pPr>
+              <w:spacing w:before="20" w:after="20"/>
+            </w:pPr>
+            <w:r>
+              <w:rPr>
+                <w:sz w:val="16"/>
+              </w:rPr>
+              <w:t xml:space="preserve"/>
+            </w:r>
+          </w:p>
+        </w:tc>
+      </w:tr>
+      <w:tr>
+        <w:tc>
+          <w:tcPr>
+            <w:tcW w:w="500" w:type="dxa"/>
+          </w:tcPr>
+          <w:p>
+            <w:pPr>
+              <w:spacing w:before="20" w:after="20"/>
+            </w:pPr>
+            <w:r>
+              <w:rPr>
+                <w:sz w:val="16"/>
+              </w:rPr>
+              <w:t xml:space="preserve">07</w:t>
+            </w:r>
+          </w:p>
+        </w:tc>
+        <w:tc>
+          <w:tcPr>
+            <w:tcW w:w="2200" w:type="dxa"/>
+          </w:tcPr>
+          <w:p>
+            <w:pPr>
+              <w:spacing w:before="20" w:after="20"/>
+            </w:pPr>
+            <w:r>
+              <w:rPr>
+                <w:sz w:val="16"/>
+                <w:i/>
+              </w:rPr>
+              <w:t xml:space="preserve">Probosciger aterrimus</w:t>
+            </w:r>
+          </w:p>
+        </w:tc>
+        <w:tc>
+          <w:tcPr>
+            <w:tcW w:w="2000" w:type="dxa"/>
+          </w:tcPr>
+          <w:p>
+            <w:pPr>
+              <w:spacing w:before="20" w:after="20"/>
+            </w:pPr>
+            <w:r>
+              <w:rPr>
+                <w:sz w:val="16"/>
+              </w:rPr>
+              <w:t xml:space="preserve">Palm Cockatoo</w:t>
+            </w:r>
+          </w:p>
+        </w:tc>
+        <w:tc>
+          <w:tcPr>
+            <w:tcW w:w="900" w:type="dxa"/>
+          </w:tcPr>
+          <w:p>
+            <w:pPr>
+              <w:spacing w:before="20" w:after="20"/>
+            </w:pPr>
+            <w:r>
+              <w:rPr>
+                <w:sz w:val="16"/>
+              </w:rPr>
+              <w:t xml:space="preserve">Bird</w:t>
+            </w:r>
+          </w:p>
+        </w:tc>
+        <w:tc>
+          <w:tcPr>
+            <w:tcW w:w="900" w:type="dxa"/>
+          </w:tcPr>
+          <w:p>
+            <w:pPr>
+              <w:spacing w:before="20" w:after="20"/>
+            </w:pPr>
+            <w:r>
+              <w:rPr>
+                <w:sz w:val="16"/>
+              </w:rPr>
+              <w:t xml:space="preserve">1000</w:t>
+            </w:r>
+          </w:p>
+        </w:tc>
+        <w:tc>
+          <w:tcPr>
+            <w:tcW w:w="1000" w:type="dxa"/>
+          </w:tcPr>
+          <w:p>
+            <w:pPr>
+              <w:spacing w:before="20" w:after="20"/>
+            </w:pPr>
+            <w:r>
+              <w:rPr>
+                <w:sz w:val="16"/>
+              </w:rPr>
+              <w:t xml:space="preserve">242</w:t>
+            </w:r>
+          </w:p>
+        </w:tc>
+        <w:tc>
+          <w:tcPr>
+            <w:tcW w:w="1000" w:type="dxa"/>
+          </w:tcPr>
+          <w:p>
+            <w:pPr>
+              <w:spacing w:before="20" w:after="20"/>
+            </w:pPr>
+            <w:r>
+              <w:rPr>
+                <w:sz w:val="16"/>
+              </w:rPr>
+              <w:t xml:space="preserve">Standard</w:t>
+            </w:r>
+          </w:p>
+        </w:tc>
+        <w:tc>
+          <w:tcPr>
+            <w:tcW w:w="1800" w:type="dxa"/>
+          </w:tcPr>
+          <w:p>
+            <w:pPr>
+              <w:spacing w:before="20" w:after="20"/>
+            </w:pPr>
+            <w:r>
+              <w:rPr>
+                <w:sz w:val="16"/>
+              </w:rPr>
+              <w:t xml:space="preserve">Capped at 1000 GBIF rows</w:t>
+            </w:r>
+          </w:p>
+        </w:tc>
+      </w:tr>
+      <w:tr>
+        <w:tc>
+          <w:tcPr>
+            <w:tcW w:w="500" w:type="dxa"/>
+          </w:tcPr>
+          <w:p>
+            <w:pPr>
+              <w:spacing w:before="20" w:after="20"/>
+            </w:pPr>
+            <w:r>
+              <w:rPr>
+                <w:sz w:val="16"/>
+              </w:rPr>
+              <w:t xml:space="preserve">08</w:t>
+            </w:r>
+          </w:p>
+        </w:tc>
+        <w:tc>
+          <w:tcPr>
+            <w:tcW w:w="2200" w:type="dxa"/>
+          </w:tcPr>
+          <w:p>
+            <w:pPr>
+              <w:spacing w:before="20" w:after="20"/>
+            </w:pPr>
+            <w:r>
+              <w:rPr>
+                <w:sz w:val="16"/>
+                <w:i/>
+              </w:rPr>
+              <w:t xml:space="preserve">Paradisaea minor</w:t>
+            </w:r>
+          </w:p>
+        </w:tc>
+        <w:tc>
+          <w:tcPr>
+            <w:tcW w:w="2000" w:type="dxa"/>
+          </w:tcPr>
+          <w:p>
+            <w:pPr>
+              <w:spacing w:before="20" w:after="20"/>
+            </w:pPr>
+            <w:r>
+              <w:rPr>
+                <w:sz w:val="16"/>
+              </w:rPr>
+              <w:t xml:space="preserve">Lesser Bird-of-paradise</w:t>
+            </w:r>
+          </w:p>
+        </w:tc>
+        <w:tc>
+          <w:tcPr>
+            <w:tcW w:w="900" w:type="dxa"/>
+          </w:tcPr>
+          <w:p>
+            <w:pPr>
+              <w:spacing w:before="20" w:after="20"/>
+            </w:pPr>
+            <w:r>
+              <w:rPr>
+                <w:sz w:val="16"/>
+              </w:rPr>
+              <w:t xml:space="preserve">Bird</w:t>
+            </w:r>
+          </w:p>
+        </w:tc>
+        <w:tc>
+          <w:tcPr>
+            <w:tcW w:w="900" w:type="dxa"/>
+          </w:tcPr>
+          <w:p>
+            <w:pPr>
+              <w:spacing w:before="20" w:after="20"/>
+            </w:pPr>
+            <w:r>
+              <w:rPr>
+                <w:sz w:val="16"/>
+              </w:rPr>
+              <w:t xml:space="preserve">1000</w:t>
+            </w:r>
+          </w:p>
+        </w:tc>
+        <w:tc>
+          <w:tcPr>
+            <w:tcW w:w="1000" w:type="dxa"/>
+          </w:tcPr>
+          <w:p>
+            <w:pPr>
+              <w:spacing w:before="20" w:after="20"/>
+            </w:pPr>
+            <w:r>
+              <w:rPr>
+                <w:sz w:val="16"/>
+              </w:rPr>
+              <w:t xml:space="preserve">261</w:t>
+            </w:r>
+          </w:p>
+        </w:tc>
+        <w:tc>
+          <w:tcPr>
+            <w:tcW w:w="1000" w:type="dxa"/>
+          </w:tcPr>
+          <w:p>
+            <w:pPr>
+              <w:spacing w:before="20" w:after="20"/>
+            </w:pPr>
+            <w:r>
+              <w:rPr>
+                <w:sz w:val="16"/>
+              </w:rPr>
+              <w:t xml:space="preserve">Standard</w:t>
+            </w:r>
+          </w:p>
+        </w:tc>
+        <w:tc>
+          <w:tcPr>
+            <w:tcW w:w="1800" w:type="dxa"/>
+          </w:tcPr>
+          <w:p>
+            <w:pPr>
+              <w:spacing w:before="20" w:after="20"/>
+            </w:pPr>
+            <w:r>
+              <w:rPr>
+                <w:sz w:val="16"/>
+              </w:rPr>
+              <w:t xml:space="preserve">Capped at 1000 GBIF rows</w:t>
+            </w:r>
+          </w:p>
+        </w:tc>
+      </w:tr>
+      <w:tr>
+        <w:tc>
+          <w:tcPr>
+            <w:tcW w:w="500" w:type="dxa"/>
+          </w:tcPr>
+          <w:p>
+            <w:pPr>
+              <w:spacing w:before="20" w:after="20"/>
+            </w:pPr>
+            <w:r>
+              <w:rPr>
+                <w:sz w:val="16"/>
+              </w:rPr>
+              <w:t xml:space="preserve">09</w:t>
+            </w:r>
+          </w:p>
+        </w:tc>
+        <w:tc>
+          <w:tcPr>
+            <w:tcW w:w="2200" w:type="dxa"/>
+          </w:tcPr>
+          <w:p>
+            <w:pPr>
+              <w:spacing w:before="20" w:after="20"/>
+            </w:pPr>
+            <w:r>
+              <w:rPr>
+                <w:sz w:val="16"/>
+                <w:i/>
+              </w:rPr>
+              <w:t xml:space="preserve">Ptiloris magnificus</w:t>
+            </w:r>
+          </w:p>
+        </w:tc>
+        <w:tc>
+          <w:tcPr>
+            <w:tcW w:w="2000" w:type="dxa"/>
+          </w:tcPr>
+          <w:p>
+            <w:pPr>
+              <w:spacing w:before="20" w:after="20"/>
+            </w:pPr>
+            <w:r>
+              <w:rPr>
+                <w:sz w:val="16"/>
+              </w:rPr>
+              <w:t xml:space="preserve">Magnificent Riflebird</w:t>
+            </w:r>
+          </w:p>
+        </w:tc>
+        <w:tc>
+          <w:tcPr>
+            <w:tcW w:w="900" w:type="dxa"/>
+          </w:tcPr>
+          <w:p>
+            <w:pPr>
+              <w:spacing w:before="20" w:after="20"/>
+            </w:pPr>
+            <w:r>
+              <w:rPr>
+                <w:sz w:val="16"/>
+              </w:rPr>
+              <w:t xml:space="preserve">Bird</w:t>
+            </w:r>
+          </w:p>
+        </w:tc>
+        <w:tc>
+          <w:tcPr>
+            <w:tcW w:w="900" w:type="dxa"/>
+          </w:tcPr>
+          <w:p>
+            <w:pPr>
+              <w:spacing w:before="20" w:after="20"/>
+            </w:pPr>
+            <w:r>
+              <w:rPr>
+                <w:sz w:val="16"/>
+              </w:rPr>
+              <w:t xml:space="preserve">807</w:t>
+            </w:r>
+          </w:p>
+        </w:tc>
+        <w:tc>
+          <w:tcPr>
+            <w:tcW w:w="1000" w:type="dxa"/>
+          </w:tcPr>
+          <w:p>
+            <w:pPr>
+              <w:spacing w:before="20" w:after="20"/>
+            </w:pPr>
+            <w:r>
+              <w:rPr>
+                <w:sz w:val="16"/>
+              </w:rPr>
+              <w:t xml:space="preserve">217</w:t>
+            </w:r>
+          </w:p>
+        </w:tc>
+        <w:tc>
+          <w:tcPr>
+            <w:tcW w:w="1000" w:type="dxa"/>
+          </w:tcPr>
+          <w:p>
+            <w:pPr>
+              <w:spacing w:before="20" w:after="20"/>
+            </w:pPr>
+            <w:r>
+              <w:rPr>
+                <w:sz w:val="16"/>
+              </w:rPr>
+              <w:t xml:space="preserve">Standard</w:t>
+            </w:r>
+          </w:p>
+        </w:tc>
+        <w:tc>
+          <w:tcPr>
+            <w:tcW w:w="1800" w:type="dxa"/>
+          </w:tcPr>
+          <w:p>
+            <w:pPr>
+              <w:spacing w:before="20" w:after="20"/>
+            </w:pPr>
+            <w:r>
+              <w:rPr>
+                <w:sz w:val="16"/>
+              </w:rPr>
+              <w:t xml:space="preserve"/>
+            </w:r>
+          </w:p>
+        </w:tc>
+      </w:tr>
+      <w:tr>
+        <w:tc>
+          <w:tcPr>
+            <w:tcW w:w="500" w:type="dxa"/>
+          </w:tcPr>
+          <w:p>
+            <w:pPr>
+              <w:spacing w:before="20" w:after="20"/>
+            </w:pPr>
+            <w:r>
+              <w:rPr>
+                <w:sz w:val="16"/>
+              </w:rPr>
+              <w:t xml:space="preserve">10</w:t>
+            </w:r>
+          </w:p>
+        </w:tc>
+        <w:tc>
+          <w:tcPr>
+            <w:tcW w:w="2200" w:type="dxa"/>
+          </w:tcPr>
+          <w:p>
+            <w:pPr>
+              <w:spacing w:before="20" w:after="20"/>
+            </w:pPr>
+            <w:r>
+              <w:rPr>
+                <w:sz w:val="16"/>
+                <w:i/>
+              </w:rPr>
+              <w:t xml:space="preserve">Ailuroedus buccoides</w:t>
+            </w:r>
+          </w:p>
+        </w:tc>
+        <w:tc>
+          <w:tcPr>
+            <w:tcW w:w="2000" w:type="dxa"/>
+          </w:tcPr>
+          <w:p>
+            <w:pPr>
+              <w:spacing w:before="20" w:after="20"/>
+            </w:pPr>
+            <w:r>
+              <w:rPr>
+                <w:sz w:val="16"/>
+              </w:rPr>
+              <w:t xml:space="preserve">White-eared Catbird</w:t>
+            </w:r>
+          </w:p>
+        </w:tc>
+        <w:tc>
+          <w:tcPr>
+            <w:tcW w:w="900" w:type="dxa"/>
+          </w:tcPr>
+          <w:p>
+            <w:pPr>
+              <w:spacing w:before="20" w:after="20"/>
+            </w:pPr>
+            <w:r>
+              <w:rPr>
+                <w:sz w:val="16"/>
+              </w:rPr>
+              <w:t xml:space="preserve">Bird</w:t>
+            </w:r>
+          </w:p>
+        </w:tc>
+        <w:tc>
+          <w:tcPr>
+            <w:tcW w:w="900" w:type="dxa"/>
+          </w:tcPr>
+          <w:p>
+            <w:pPr>
+              <w:spacing w:before="20" w:after="20"/>
+            </w:pPr>
+            <w:r>
+              <w:rPr>
+                <w:sz w:val="16"/>
+              </w:rPr>
+              <w:t xml:space="preserve">39</w:t>
+            </w:r>
+          </w:p>
+        </w:tc>
+        <w:tc>
+          <w:tcPr>
+            <w:tcW w:w="1000" w:type="dxa"/>
+          </w:tcPr>
+          <w:p>
+            <w:pPr>
+              <w:spacing w:before="20" w:after="20"/>
+            </w:pPr>
+            <w:r>
+              <w:rPr>
+                <w:sz w:val="16"/>
+              </w:rPr>
+              <w:t xml:space="preserve">26</w:t>
+            </w:r>
+          </w:p>
+        </w:tc>
+        <w:tc>
+          <w:tcPr>
+            <w:tcW w:w="1000" w:type="dxa"/>
+          </w:tcPr>
+          <w:p>
+            <w:pPr>
+              <w:spacing w:before="20" w:after="20"/>
+            </w:pPr>
+            <w:r>
+              <w:rPr>
+                <w:sz w:val="16"/>
+              </w:rPr>
+              <w:t xml:space="preserve">Exploratory</w:t>
+            </w:r>
+          </w:p>
+        </w:tc>
+        <w:tc>
+          <w:tcPr>
+            <w:tcW w:w="1800" w:type="dxa"/>
+          </w:tcPr>
+          <w:p>
+            <w:pPr>
+              <w:spacing w:before="20" w:after="20"/>
+            </w:pPr>
+            <w:r>
+              <w:rPr>
+                <w:sz w:val="16"/>
+              </w:rPr>
+              <w:t xml:space="preserve">Map 3 exploratory (unique sites below 30)</w:t>
+            </w:r>
+          </w:p>
+        </w:tc>
+      </w:tr>
+      <w:tr>
+        <w:tc>
+          <w:tcPr>
+            <w:tcW w:w="500" w:type="dxa"/>
+          </w:tcPr>
+          <w:p>
+            <w:pPr>
+              <w:spacing w:before="20" w:after="20"/>
+            </w:pPr>
+            <w:r>
+              <w:rPr>
+                <w:sz w:val="16"/>
+              </w:rPr>
+              <w:t xml:space="preserve">11</w:t>
+            </w:r>
+          </w:p>
+        </w:tc>
+        <w:tc>
+          <w:tcPr>
+            <w:tcW w:w="2200" w:type="dxa"/>
+          </w:tcPr>
+          <w:p>
+            <w:pPr>
+              <w:spacing w:before="20" w:after="20"/>
+            </w:pPr>
+            <w:r>
+              <w:rPr>
+                <w:sz w:val="16"/>
+                <w:i/>
+              </w:rPr>
+              <w:t xml:space="preserve">Paradisaea raggiana</w:t>
+            </w:r>
+          </w:p>
+        </w:tc>
+        <w:tc>
+          <w:tcPr>
+            <w:tcW w:w="2000" w:type="dxa"/>
+          </w:tcPr>
+          <w:p>
+            <w:pPr>
+              <w:spacing w:before="20" w:after="20"/>
+            </w:pPr>
+            <w:r>
+              <w:rPr>
+                <w:sz w:val="16"/>
+              </w:rPr>
+              <w:t xml:space="preserve">Raggiana Bird-of-paradise</w:t>
+            </w:r>
+          </w:p>
+        </w:tc>
+        <w:tc>
+          <w:tcPr>
+            <w:tcW w:w="900" w:type="dxa"/>
+          </w:tcPr>
+          <w:p>
+            <w:pPr>
+              <w:spacing w:before="20" w:after="20"/>
+            </w:pPr>
+            <w:r>
+              <w:rPr>
+                <w:sz w:val="16"/>
+              </w:rPr>
+              <w:t xml:space="preserve">Bird</w:t>
+            </w:r>
+          </w:p>
+        </w:tc>
+        <w:tc>
+          <w:tcPr>
+            <w:tcW w:w="900" w:type="dxa"/>
+          </w:tcPr>
+          <w:p>
+            <w:pPr>
+              <w:spacing w:before="20" w:after="20"/>
+            </w:pPr>
+            <w:r>
+              <w:rPr>
+                <w:sz w:val="16"/>
+              </w:rPr>
+              <w:t xml:space="preserve">1000</w:t>
+            </w:r>
+          </w:p>
+        </w:tc>
+        <w:tc>
+          <w:tcPr>
+            <w:tcW w:w="1000" w:type="dxa"/>
+          </w:tcPr>
+          <w:p>
+            <w:pPr>
+              <w:spacing w:before="20" w:after="20"/>
+            </w:pPr>
+            <w:r>
+              <w:rPr>
+                <w:sz w:val="16"/>
+              </w:rPr>
+              <w:t xml:space="preserve">182</w:t>
+            </w:r>
+          </w:p>
+        </w:tc>
+        <w:tc>
+          <w:tcPr>
+            <w:tcW w:w="1000" w:type="dxa"/>
+          </w:tcPr>
+          <w:p>
+            <w:pPr>
+              <w:spacing w:before="20" w:after="20"/>
+            </w:pPr>
+            <w:r>
+              <w:rPr>
+                <w:sz w:val="16"/>
+              </w:rPr>
+              <w:t xml:space="preserve">Standard</w:t>
+            </w:r>
+          </w:p>
+        </w:tc>
+        <w:tc>
+          <w:tcPr>
+            <w:tcW w:w="1800" w:type="dxa"/>
+          </w:tcPr>
+          <w:p>
+            <w:pPr>
+              <w:spacing w:before="20" w:after="20"/>
+            </w:pPr>
+            <w:r>
+              <w:rPr>
+                <w:sz w:val="16"/>
+              </w:rPr>
+              <w:t xml:space="preserve">Capped at 1000 GBIF rows</w:t>
+            </w:r>
+          </w:p>
+        </w:tc>
+      </w:tr>
+      <w:tr>
+        <w:tc>
+          <w:tcPr>
+            <w:tcW w:w="500" w:type="dxa"/>
+          </w:tcPr>
+          <w:p>
+            <w:pPr>
+              <w:spacing w:before="20" w:after="20"/>
+            </w:pPr>
+            <w:r>
+              <w:rPr>
+                <w:sz w:val="16"/>
+              </w:rPr>
+              <w:t xml:space="preserve">12</w:t>
+            </w:r>
+          </w:p>
+        </w:tc>
+        <w:tc>
+          <w:tcPr>
+            <w:tcW w:w="2200" w:type="dxa"/>
+          </w:tcPr>
+          <w:p>
+            <w:pPr>
+              <w:spacing w:before="20" w:after="20"/>
+            </w:pPr>
+            <w:r>
+              <w:rPr>
+                <w:sz w:val="16"/>
+                <w:i/>
+              </w:rPr>
+              <w:t xml:space="preserve">Astrapia stephaniae</w:t>
+            </w:r>
+          </w:p>
+        </w:tc>
+        <w:tc>
+          <w:tcPr>
+            <w:tcW w:w="2000" w:type="dxa"/>
+          </w:tcPr>
+          <w:p>
+            <w:pPr>
+              <w:spacing w:before="20" w:after="20"/>
+            </w:pPr>
+            <w:r>
+              <w:rPr>
+                <w:sz w:val="16"/>
+              </w:rPr>
+              <w:t xml:space="preserve">Stephanie's Astrapia</w:t>
+            </w:r>
+          </w:p>
+        </w:tc>
+        <w:tc>
+          <w:tcPr>
+            <w:tcW w:w="900" w:type="dxa"/>
+          </w:tcPr>
+          <w:p>
+            <w:pPr>
+              <w:spacing w:before="20" w:after="20"/>
+            </w:pPr>
+            <w:r>
+              <w:rPr>
+                <w:sz w:val="16"/>
+              </w:rPr>
+              <w:t xml:space="preserve">Bird</w:t>
+            </w:r>
+          </w:p>
+        </w:tc>
+        <w:tc>
+          <w:tcPr>
+            <w:tcW w:w="900" w:type="dxa"/>
+          </w:tcPr>
+          <w:p>
+            <w:pPr>
+              <w:spacing w:before="20" w:after="20"/>
+            </w:pPr>
+            <w:r>
+              <w:rPr>
+                <w:sz w:val="16"/>
+              </w:rPr>
+              <w:t xml:space="preserve">1000</w:t>
+            </w:r>
+          </w:p>
+        </w:tc>
+        <w:tc>
+          <w:tcPr>
+            <w:tcW w:w="1000" w:type="dxa"/>
+          </w:tcPr>
+          <w:p>
+            <w:pPr>
+              <w:spacing w:before="20" w:after="20"/>
+            </w:pPr>
+            <w:r>
+              <w:rPr>
+                <w:sz w:val="16"/>
+              </w:rPr>
+              <w:t xml:space="preserve">118</w:t>
+            </w:r>
+          </w:p>
+        </w:tc>
+        <w:tc>
+          <w:tcPr>
+            <w:tcW w:w="1000" w:type="dxa"/>
+          </w:tcPr>
+          <w:p>
+            <w:pPr>
+              <w:spacing w:before="20" w:after="20"/>
+            </w:pPr>
+            <w:r>
+              <w:rPr>
+                <w:sz w:val="16"/>
+              </w:rPr>
+              <w:t xml:space="preserve">Standard</w:t>
+            </w:r>
+          </w:p>
+        </w:tc>
+        <w:tc>
+          <w:tcPr>
+            <w:tcW w:w="1800" w:type="dxa"/>
+          </w:tcPr>
+          <w:p>
+            <w:pPr>
+              <w:spacing w:before="20" w:after="20"/>
+            </w:pPr>
+            <w:r>
+              <w:rPr>
+                <w:sz w:val="16"/>
+              </w:rPr>
+              <w:t xml:space="preserve">Capped at 1000 GBIF rows</w:t>
+            </w:r>
+          </w:p>
+        </w:tc>
+      </w:tr>
+      <w:tr>
+        <w:tc>
+          <w:tcPr>
+            <w:tcW w:w="500" w:type="dxa"/>
+          </w:tcPr>
+          <w:p>
+            <w:pPr>
+              <w:spacing w:before="20" w:after="20"/>
+            </w:pPr>
+            <w:r>
+              <w:rPr>
+                <w:sz w:val="16"/>
+              </w:rPr>
+              <w:t xml:space="preserve">13</w:t>
+            </w:r>
+          </w:p>
+        </w:tc>
+        <w:tc>
+          <w:tcPr>
+            <w:tcW w:w="2200" w:type="dxa"/>
+          </w:tcPr>
+          <w:p>
+            <w:pPr>
+              <w:spacing w:before="20" w:after="20"/>
+            </w:pPr>
+            <w:r>
+              <w:rPr>
+                <w:sz w:val="16"/>
+                <w:i/>
+              </w:rPr>
+              <w:t xml:space="preserve">Harpyopsis novaeguineae</w:t>
+            </w:r>
+          </w:p>
+        </w:tc>
+        <w:tc>
+          <w:tcPr>
+            <w:tcW w:w="2000" w:type="dxa"/>
+          </w:tcPr>
+          <w:p>
+            <w:pPr>
+              <w:spacing w:before="20" w:after="20"/>
+            </w:pPr>
+            <w:r>
+              <w:rPr>
+                <w:sz w:val="16"/>
+              </w:rPr>
+              <w:t xml:space="preserve">New Guinea Harpy Eagle</w:t>
+            </w:r>
+          </w:p>
+        </w:tc>
+        <w:tc>
+          <w:tcPr>
+            <w:tcW w:w="900" w:type="dxa"/>
+          </w:tcPr>
+          <w:p>
+            <w:pPr>
+              <w:spacing w:before="20" w:after="20"/>
+            </w:pPr>
+            <w:r>
+              <w:rPr>
+                <w:sz w:val="16"/>
+              </w:rPr>
+              <w:t xml:space="preserve">Bird</w:t>
+            </w:r>
+          </w:p>
+        </w:tc>
+        <w:tc>
+          <w:tcPr>
+            <w:tcW w:w="900" w:type="dxa"/>
+          </w:tcPr>
+          <w:p>
+            <w:pPr>
+              <w:spacing w:before="20" w:after="20"/>
+            </w:pPr>
+            <w:r>
+              <w:rPr>
+                <w:sz w:val="16"/>
+              </w:rPr>
+              <w:t xml:space="preserve">369</w:t>
+            </w:r>
+          </w:p>
+        </w:tc>
+        <w:tc>
+          <w:tcPr>
+            <w:tcW w:w="1000" w:type="dxa"/>
+          </w:tcPr>
+          <w:p>
+            <w:pPr>
+              <w:spacing w:before="20" w:after="20"/>
+            </w:pPr>
+            <w:r>
+              <w:rPr>
+                <w:sz w:val="16"/>
+              </w:rPr>
+              <w:t xml:space="preserve">145</w:t>
+            </w:r>
+          </w:p>
+        </w:tc>
+        <w:tc>
+          <w:tcPr>
+            <w:tcW w:w="1000" w:type="dxa"/>
+          </w:tcPr>
+          <w:p>
+            <w:pPr>
+              <w:spacing w:before="20" w:after="20"/>
+            </w:pPr>
+            <w:r>
+              <w:rPr>
+                <w:sz w:val="16"/>
+              </w:rPr>
+              <w:t xml:space="preserve">Standard</w:t>
+            </w:r>
+          </w:p>
+        </w:tc>
+        <w:tc>
+          <w:tcPr>
+            <w:tcW w:w="1800" w:type="dxa"/>
+          </w:tcPr>
+          <w:p>
+            <w:pPr>
+              <w:spacing w:before="20" w:after="20"/>
+            </w:pPr>
+            <w:r>
+              <w:rPr>
+                <w:sz w:val="16"/>
+              </w:rPr>
+              <w:t xml:space="preserve"/>
+            </w:r>
+          </w:p>
+        </w:tc>
+      </w:tr>
+      <w:tr>
+        <w:tc>
+          <w:tcPr>
+            <w:tcW w:w="500" w:type="dxa"/>
+          </w:tcPr>
+          <w:p>
+            <w:pPr>
+              <w:spacing w:before="20" w:after="20"/>
+            </w:pPr>
+            <w:r>
+              <w:rPr>
+                <w:sz w:val="16"/>
+              </w:rPr>
+              <w:t xml:space="preserve">14</w:t>
+            </w:r>
+          </w:p>
+        </w:tc>
+        <w:tc>
+          <w:tcPr>
+            <w:tcW w:w="2200" w:type="dxa"/>
+          </w:tcPr>
+          <w:p>
+            <w:pPr>
+              <w:spacing w:before="20" w:after="20"/>
+            </w:pPr>
+            <w:r>
+              <w:rPr>
+                <w:sz w:val="16"/>
+                <w:i/>
+              </w:rPr>
+              <w:t xml:space="preserve">Rhyticeros plicatus</w:t>
+            </w:r>
+          </w:p>
+        </w:tc>
+        <w:tc>
+          <w:tcPr>
+            <w:tcW w:w="2000" w:type="dxa"/>
+          </w:tcPr>
+          <w:p>
+            <w:pPr>
+              <w:spacing w:before="20" w:after="20"/>
+            </w:pPr>
+            <w:r>
+              <w:rPr>
+                <w:sz w:val="16"/>
+              </w:rPr>
+              <w:t xml:space="preserve">Papuan Hornbill</w:t>
+            </w:r>
+          </w:p>
+        </w:tc>
+        <w:tc>
+          <w:tcPr>
+            <w:tcW w:w="900" w:type="dxa"/>
+          </w:tcPr>
+          <w:p>
+            <w:pPr>
+              <w:spacing w:before="20" w:after="20"/>
+            </w:pPr>
+            <w:r>
+              <w:rPr>
+                <w:sz w:val="16"/>
+              </w:rPr>
+              <w:t xml:space="preserve">Bird</w:t>
+            </w:r>
+          </w:p>
+        </w:tc>
+        <w:tc>
+          <w:tcPr>
+            <w:tcW w:w="900" w:type="dxa"/>
+          </w:tcPr>
+          <w:p>
+            <w:pPr>
+              <w:spacing w:before="20" w:after="20"/>
+            </w:pPr>
+            <w:r>
+              <w:rPr>
+                <w:sz w:val="16"/>
+              </w:rPr>
+              <w:t xml:space="preserve">1000</w:t>
+            </w:r>
+          </w:p>
+        </w:tc>
+        <w:tc>
+          <w:tcPr>
+            <w:tcW w:w="1000" w:type="dxa"/>
+          </w:tcPr>
+          <w:p>
+            <w:pPr>
+              <w:spacing w:before="20" w:after="20"/>
+            </w:pPr>
+            <w:r>
+              <w:rPr>
+                <w:sz w:val="16"/>
+              </w:rPr>
+              <w:t xml:space="preserve">237</w:t>
+            </w:r>
+          </w:p>
+        </w:tc>
+        <w:tc>
+          <w:tcPr>
+            <w:tcW w:w="1000" w:type="dxa"/>
+          </w:tcPr>
+          <w:p>
+            <w:pPr>
+              <w:spacing w:before="20" w:after="20"/>
+            </w:pPr>
+            <w:r>
+              <w:rPr>
+                <w:sz w:val="16"/>
+              </w:rPr>
+              <w:t xml:space="preserve">Standard</w:t>
+            </w:r>
+          </w:p>
+        </w:tc>
+        <w:tc>
+          <w:tcPr>
+            <w:tcW w:w="1800" w:type="dxa"/>
+          </w:tcPr>
+          <w:p>
+            <w:pPr>
+              <w:spacing w:before="20" w:after="20"/>
+            </w:pPr>
+            <w:r>
+              <w:rPr>
+                <w:sz w:val="16"/>
+              </w:rPr>
+              <w:t xml:space="preserve">Capped at 1000 GBIF rows</w:t>
+            </w:r>
+          </w:p>
+        </w:tc>
+      </w:tr>
+      <w:tr>
+        <w:tc>
+          <w:tcPr>
+            <w:tcW w:w="500" w:type="dxa"/>
+          </w:tcPr>
+          <w:p>
+            <w:pPr>
+              <w:spacing w:before="20" w:after="20"/>
+            </w:pPr>
+            <w:r>
+              <w:rPr>
+                <w:sz w:val="16"/>
+              </w:rPr>
+              <w:t xml:space="preserve">15</w:t>
+            </w:r>
+          </w:p>
+        </w:tc>
+        <w:tc>
+          <w:tcPr>
+            <w:tcW w:w="2200" w:type="dxa"/>
+          </w:tcPr>
+          <w:p>
+            <w:pPr>
+              <w:spacing w:before="20" w:after="20"/>
+            </w:pPr>
+            <w:r>
+              <w:rPr>
+                <w:sz w:val="16"/>
+                <w:i/>
+              </w:rPr>
+              <w:t xml:space="preserve">Spilocuscus maculatus</w:t>
+            </w:r>
+          </w:p>
+        </w:tc>
+        <w:tc>
+          <w:tcPr>
+            <w:tcW w:w="2000" w:type="dxa"/>
+          </w:tcPr>
+          <w:p>
+            <w:pPr>
+              <w:spacing w:before="20" w:after="20"/>
+            </w:pPr>
+            <w:r>
+              <w:rPr>
+                <w:sz w:val="16"/>
+              </w:rPr>
+              <w:t xml:space="preserve">Common Spotted Cuscus</w:t>
+            </w:r>
+          </w:p>
+        </w:tc>
+        <w:tc>
+          <w:tcPr>
+            <w:tcW w:w="900" w:type="dxa"/>
+          </w:tcPr>
+          <w:p>
+            <w:pPr>
+              <w:spacing w:before="20" w:after="20"/>
+            </w:pPr>
+            <w:r>
+              <w:rPr>
+                <w:sz w:val="16"/>
+              </w:rPr>
+              <w:t xml:space="preserve">Mammal</w:t>
+            </w:r>
+          </w:p>
+        </w:tc>
+        <w:tc>
+          <w:tcPr>
+            <w:tcW w:w="900" w:type="dxa"/>
+          </w:tcPr>
+          <w:p>
+            <w:pPr>
+              <w:spacing w:before="20" w:after="20"/>
+            </w:pPr>
+            <w:r>
+              <w:rPr>
+                <w:sz w:val="16"/>
+              </w:rPr>
+              <w:t xml:space="preserve">197</w:t>
+            </w:r>
+          </w:p>
+        </w:tc>
+        <w:tc>
+          <w:tcPr>
+            <w:tcW w:w="1000" w:type="dxa"/>
+          </w:tcPr>
+          <w:p>
+            <w:pPr>
+              <w:spacing w:before="20" w:after="20"/>
+            </w:pPr>
+            <w:r>
+              <w:rPr>
+                <w:sz w:val="16"/>
+              </w:rPr>
+              <w:t xml:space="preserve">87</w:t>
+            </w:r>
+          </w:p>
+        </w:tc>
+        <w:tc>
+          <w:tcPr>
+            <w:tcW w:w="1000" w:type="dxa"/>
+          </w:tcPr>
+          <w:p>
+            <w:pPr>
+              <w:spacing w:before="20" w:after="20"/>
+            </w:pPr>
+            <w:r>
+              <w:rPr>
+                <w:sz w:val="16"/>
+              </w:rPr>
+              <w:t xml:space="preserve">Standard</w:t>
+            </w:r>
+          </w:p>
+        </w:tc>
+        <w:tc>
+          <w:tcPr>
+            <w:tcW w:w="1800" w:type="dxa"/>
+          </w:tcPr>
+          <w:p>
+            <w:pPr>
+              <w:spacing w:before="20" w:after="20"/>
+            </w:pPr>
+            <w:r>
+              <w:rPr>
+                <w:sz w:val="16"/>
+              </w:rPr>
+              <w:t xml:space="preserve"/>
+            </w:r>
+          </w:p>
+        </w:tc>
+      </w:tr>
+      <w:tr>
+        <w:tc>
+          <w:tcPr>
+            <w:tcW w:w="500" w:type="dxa"/>
+          </w:tcPr>
+          <w:p>
+            <w:pPr>
+              <w:spacing w:before="20" w:after="20"/>
+            </w:pPr>
+            <w:r>
+              <w:rPr>
+                <w:sz w:val="16"/>
+              </w:rPr>
+              <w:t xml:space="preserve">16</w:t>
+            </w:r>
+          </w:p>
+        </w:tc>
+        <w:tc>
+          <w:tcPr>
+            <w:tcW w:w="2200" w:type="dxa"/>
+          </w:tcPr>
+          <w:p>
+            <w:pPr>
+              <w:spacing w:before="20" w:after="20"/>
+            </w:pPr>
+            <w:r>
+              <w:rPr>
+                <w:sz w:val="16"/>
+                <w:i/>
+              </w:rPr>
+              <w:t xml:space="preserve">Dasyurus albopunctatus</w:t>
+            </w:r>
+          </w:p>
+        </w:tc>
+        <w:tc>
+          <w:tcPr>
+            <w:tcW w:w="2000" w:type="dxa"/>
+          </w:tcPr>
+          <w:p>
+            <w:pPr>
+              <w:spacing w:before="20" w:after="20"/>
+            </w:pPr>
+            <w:r>
+              <w:rPr>
+                <w:sz w:val="16"/>
+              </w:rPr>
+              <w:t xml:space="preserve">New Guinea Quoll</w:t>
+            </w:r>
+          </w:p>
+        </w:tc>
+        <w:tc>
+          <w:tcPr>
+            <w:tcW w:w="900" w:type="dxa"/>
+          </w:tcPr>
+          <w:p>
+            <w:pPr>
+              <w:spacing w:before="20" w:after="20"/>
+            </w:pPr>
+            <w:r>
+              <w:rPr>
+                <w:sz w:val="16"/>
+              </w:rPr>
+              <w:t xml:space="preserve">Mammal</w:t>
+            </w:r>
+          </w:p>
+        </w:tc>
+        <w:tc>
+          <w:tcPr>
+            <w:tcW w:w="900" w:type="dxa"/>
+          </w:tcPr>
+          <w:p>
+            <w:pPr>
+              <w:spacing w:before="20" w:after="20"/>
+            </w:pPr>
+            <w:r>
+              <w:rPr>
+                <w:sz w:val="16"/>
+              </w:rPr>
+              <w:t xml:space="preserve">27</w:t>
+            </w:r>
+          </w:p>
+        </w:tc>
+        <w:tc>
+          <w:tcPr>
+            <w:tcW w:w="1000" w:type="dxa"/>
+          </w:tcPr>
+          <w:p>
+            <w:pPr>
+              <w:spacing w:before="20" w:after="20"/>
+            </w:pPr>
+            <w:r>
+              <w:rPr>
+                <w:sz w:val="16"/>
+              </w:rPr>
+              <w:t xml:space="preserve">21</w:t>
+            </w:r>
+          </w:p>
+        </w:tc>
+        <w:tc>
+          <w:tcPr>
+            <w:tcW w:w="1000" w:type="dxa"/>
+          </w:tcPr>
+          <w:p>
+            <w:pPr>
+              <w:spacing w:before="20" w:after="20"/>
+            </w:pPr>
+            <w:r>
+              <w:rPr>
+                <w:sz w:val="16"/>
+              </w:rPr>
+              <w:t xml:space="preserve">Exploratory</w:t>
+            </w:r>
+          </w:p>
+        </w:tc>
+        <w:tc>
+          <w:tcPr>
+            <w:tcW w:w="1800" w:type="dxa"/>
+          </w:tcPr>
+          <w:p>
+            <w:pPr>
+              <w:spacing w:before="20" w:after="20"/>
+            </w:pPr>
+            <w:r>
+              <w:rPr>
+                <w:sz w:val="16"/>
+              </w:rPr>
+              <w:t xml:space="preserve">Map 3 exploratory (n below 30)</w:t>
+            </w:r>
+          </w:p>
+        </w:tc>
+      </w:tr>
+      <w:tr>
+        <w:tc>
+          <w:tcPr>
+            <w:tcW w:w="500" w:type="dxa"/>
+          </w:tcPr>
+          <w:p>
+            <w:pPr>
+              <w:spacing w:before="20" w:after="20"/>
+            </w:pPr>
+            <w:r>
+              <w:rPr>
+                <w:sz w:val="16"/>
+              </w:rPr>
+              <w:t xml:space="preserve">17</w:t>
+            </w:r>
+          </w:p>
+        </w:tc>
+        <w:tc>
+          <w:tcPr>
+            <w:tcW w:w="2200" w:type="dxa"/>
+          </w:tcPr>
+          <w:p>
+            <w:pPr>
+              <w:spacing w:before="20" w:after="20"/>
+            </w:pPr>
+            <w:r>
+              <w:rPr>
+                <w:sz w:val="16"/>
+                <w:i/>
+              </w:rPr>
+              <w:t xml:space="preserve">Phalanger orientalis</w:t>
+            </w:r>
+          </w:p>
+        </w:tc>
+        <w:tc>
+          <w:tcPr>
+            <w:tcW w:w="2000" w:type="dxa"/>
+          </w:tcPr>
+          <w:p>
+            <w:pPr>
+              <w:spacing w:before="20" w:after="20"/>
+            </w:pPr>
+            <w:r>
+              <w:rPr>
+                <w:sz w:val="16"/>
+              </w:rPr>
+              <w:t xml:space="preserve">Northern Common Cuscus</w:t>
+            </w:r>
+          </w:p>
+        </w:tc>
+        <w:tc>
+          <w:tcPr>
+            <w:tcW w:w="900" w:type="dxa"/>
+          </w:tcPr>
+          <w:p>
+            <w:pPr>
+              <w:spacing w:before="20" w:after="20"/>
+            </w:pPr>
+            <w:r>
+              <w:rPr>
+                <w:sz w:val="16"/>
+              </w:rPr>
+              <w:t xml:space="preserve">Mammal</w:t>
+            </w:r>
+          </w:p>
+        </w:tc>
+        <w:tc>
+          <w:tcPr>
+            <w:tcW w:w="900" w:type="dxa"/>
+          </w:tcPr>
+          <w:p>
+            <w:pPr>
+              <w:spacing w:before="20" w:after="20"/>
+            </w:pPr>
+            <w:r>
+              <w:rPr>
+                <w:sz w:val="16"/>
+              </w:rPr>
+              <w:t xml:space="preserve">44</w:t>
+            </w:r>
+          </w:p>
+        </w:tc>
+        <w:tc>
+          <w:tcPr>
+            <w:tcW w:w="1000" w:type="dxa"/>
+          </w:tcPr>
+          <w:p>
+            <w:pPr>
+              <w:spacing w:before="20" w:after="20"/>
+            </w:pPr>
+            <w:r>
+              <w:rPr>
+                <w:sz w:val="16"/>
+              </w:rPr>
+              <w:t xml:space="preserve">33</w:t>
+            </w:r>
+          </w:p>
+        </w:tc>
+        <w:tc>
+          <w:tcPr>
+            <w:tcW w:w="1000" w:type="dxa"/>
+          </w:tcPr>
+          <w:p>
+            <w:pPr>
+              <w:spacing w:before="20" w:after="20"/>
+            </w:pPr>
+            <w:r>
+              <w:rPr>
+                <w:sz w:val="16"/>
+              </w:rPr>
+              <w:t xml:space="preserve">Standard</w:t>
+            </w:r>
+          </w:p>
+        </w:tc>
+        <w:tc>
+          <w:tcPr>
+            <w:tcW w:w="1800" w:type="dxa"/>
+          </w:tcPr>
+          <w:p>
+            <w:pPr>
+              <w:spacing w:before="20" w:after="20"/>
+            </w:pPr>
+            <w:r>
+              <w:rPr>
+                <w:sz w:val="16"/>
+              </w:rPr>
+              <w:t xml:space="preserve"/>
+            </w:r>
+          </w:p>
+        </w:tc>
+      </w:tr>
+      <w:tr>
+        <w:tc>
+          <w:tcPr>
+            <w:tcW w:w="500" w:type="dxa"/>
+          </w:tcPr>
+          <w:p>
+            <w:pPr>
+              <w:spacing w:before="20" w:after="20"/>
+            </w:pPr>
+            <w:r>
+              <w:rPr>
+                <w:sz w:val="16"/>
+              </w:rPr>
+              <w:t xml:space="preserve">18</w:t>
+            </w:r>
+          </w:p>
+        </w:tc>
+        <w:tc>
+          <w:tcPr>
+            <w:tcW w:w="2200" w:type="dxa"/>
+          </w:tcPr>
+          <w:p>
+            <w:pPr>
+              <w:spacing w:before="20" w:after="20"/>
+            </w:pPr>
+            <w:r>
+              <w:rPr>
+                <w:sz w:val="16"/>
+                <w:i/>
+              </w:rPr>
+              <w:t xml:space="preserve">Pseudochirulus forbesi</w:t>
+            </w:r>
+          </w:p>
+        </w:tc>
+        <w:tc>
+          <w:tcPr>
+            <w:tcW w:w="2000" w:type="dxa"/>
+          </w:tcPr>
+          <w:p>
+            <w:pPr>
+              <w:spacing w:before="20" w:after="20"/>
+            </w:pPr>
+            <w:r>
+              <w:rPr>
+                <w:sz w:val="16"/>
+              </w:rPr>
+              <w:t xml:space="preserve">Painted Ring-tailed Possum</w:t>
+            </w:r>
+          </w:p>
+        </w:tc>
+        <w:tc>
+          <w:tcPr>
+            <w:tcW w:w="900" w:type="dxa"/>
+          </w:tcPr>
+          <w:p>
+            <w:pPr>
+              <w:spacing w:before="20" w:after="20"/>
+            </w:pPr>
+            <w:r>
+              <w:rPr>
+                <w:sz w:val="16"/>
+              </w:rPr>
+              <w:t xml:space="preserve">Mammal</w:t>
+            </w:r>
+          </w:p>
+        </w:tc>
+        <w:tc>
+          <w:tcPr>
+            <w:tcW w:w="900" w:type="dxa"/>
+          </w:tcPr>
+          <w:p>
+            <w:pPr>
+              <w:spacing w:before="20" w:after="20"/>
+            </w:pPr>
+            <w:r>
+              <w:rPr>
+                <w:sz w:val="16"/>
+              </w:rPr>
+              <w:t xml:space="preserve">63</w:t>
+            </w:r>
+          </w:p>
+        </w:tc>
+        <w:tc>
+          <w:tcPr>
+            <w:tcW w:w="1000" w:type="dxa"/>
+          </w:tcPr>
+          <w:p>
+            <w:pPr>
+              <w:spacing w:before="20" w:after="20"/>
+            </w:pPr>
+            <w:r>
+              <w:rPr>
+                <w:sz w:val="16"/>
+              </w:rPr>
+              <w:t xml:space="preserve">24</w:t>
+            </w:r>
+          </w:p>
+        </w:tc>
+        <w:tc>
+          <w:tcPr>
+            <w:tcW w:w="1000" w:type="dxa"/>
+          </w:tcPr>
+          <w:p>
+            <w:pPr>
+              <w:spacing w:before="20" w:after="20"/>
+            </w:pPr>
+            <w:r>
+              <w:rPr>
+                <w:sz w:val="16"/>
+              </w:rPr>
+              <w:t xml:space="preserve">Exploratory</w:t>
+            </w:r>
+          </w:p>
+        </w:tc>
+        <w:tc>
+          <w:tcPr>
+            <w:tcW w:w="1800" w:type="dxa"/>
+          </w:tcPr>
+          <w:p>
+            <w:pPr>
+              <w:spacing w:before="20" w:after="20"/>
+            </w:pPr>
+            <w:r>
+              <w:rPr>
+                <w:sz w:val="16"/>
+              </w:rPr>
+              <w:t xml:space="preserve">Map 3 exploratory (unique sites below 30)</w:t>
+            </w:r>
+          </w:p>
+        </w:tc>
+      </w:tr>
+      <w:tr>
+        <w:tc>
+          <w:tcPr>
+            <w:tcW w:w="500" w:type="dxa"/>
+          </w:tcPr>
+          <w:p>
+            <w:pPr>
+              <w:spacing w:before="20" w:after="20"/>
+            </w:pPr>
+            <w:r>
+              <w:rPr>
+                <w:sz w:val="16"/>
+              </w:rPr>
+              <w:t xml:space="preserve">19</w:t>
+            </w:r>
+          </w:p>
+        </w:tc>
+        <w:tc>
+          <w:tcPr>
+            <w:tcW w:w="2200" w:type="dxa"/>
+          </w:tcPr>
+          <w:p>
+            <w:pPr>
+              <w:spacing w:before="20" w:after="20"/>
+            </w:pPr>
+            <w:r>
+              <w:rPr>
+                <w:sz w:val="16"/>
+                <w:i/>
+              </w:rPr>
+              <w:t xml:space="preserve">Dactylopsila trivirgata</w:t>
+            </w:r>
+          </w:p>
+        </w:tc>
+        <w:tc>
+          <w:tcPr>
+            <w:tcW w:w="2000" w:type="dxa"/>
+          </w:tcPr>
+          <w:p>
+            <w:pPr>
+              <w:spacing w:before="20" w:after="20"/>
+            </w:pPr>
+            <w:r>
+              <w:rPr>
+                <w:sz w:val="16"/>
+              </w:rPr>
+              <w:t xml:space="preserve">Striped Possum</w:t>
+            </w:r>
+          </w:p>
+        </w:tc>
+        <w:tc>
+          <w:tcPr>
+            <w:tcW w:w="900" w:type="dxa"/>
+          </w:tcPr>
+          <w:p>
+            <w:pPr>
+              <w:spacing w:before="20" w:after="20"/>
+            </w:pPr>
+            <w:r>
+              <w:rPr>
+                <w:sz w:val="16"/>
+              </w:rPr>
+              <w:t xml:space="preserve">Mammal</w:t>
+            </w:r>
+          </w:p>
+        </w:tc>
+        <w:tc>
+          <w:tcPr>
+            <w:tcW w:w="900" w:type="dxa"/>
+          </w:tcPr>
+          <w:p>
+            <w:pPr>
+              <w:spacing w:before="20" w:after="20"/>
+            </w:pPr>
+            <w:r>
+              <w:rPr>
+                <w:sz w:val="16"/>
+              </w:rPr>
+              <w:t xml:space="preserve">179</w:t>
+            </w:r>
+          </w:p>
+        </w:tc>
+        <w:tc>
+          <w:tcPr>
+            <w:tcW w:w="1000" w:type="dxa"/>
+          </w:tcPr>
+          <w:p>
+            <w:pPr>
+              <w:spacing w:before="20" w:after="20"/>
+            </w:pPr>
+            <w:r>
+              <w:rPr>
+                <w:sz w:val="16"/>
+              </w:rPr>
+              <w:t xml:space="preserve">48</w:t>
+            </w:r>
+          </w:p>
+        </w:tc>
+        <w:tc>
+          <w:tcPr>
+            <w:tcW w:w="1000" w:type="dxa"/>
+          </w:tcPr>
+          <w:p>
+            <w:pPr>
+              <w:spacing w:before="20" w:after="20"/>
+            </w:pPr>
+            <w:r>
+              <w:rPr>
+                <w:sz w:val="16"/>
+              </w:rPr>
+              <w:t xml:space="preserve">Standard</w:t>
+            </w:r>
+          </w:p>
+        </w:tc>
+        <w:tc>
+          <w:tcPr>
+            <w:tcW w:w="1800" w:type="dxa"/>
+          </w:tcPr>
+          <w:p>
+            <w:pPr>
+              <w:spacing w:before="20" w:after="20"/>
+            </w:pPr>
+            <w:r>
+              <w:rPr>
+                <w:sz w:val="16"/>
+              </w:rPr>
+              <w:t xml:space="preserve"/>
+            </w:r>
+          </w:p>
+        </w:tc>
+      </w:tr>
+      <w:tr>
+        <w:tc>
+          <w:tcPr>
+            <w:tcW w:w="500" w:type="dxa"/>
+          </w:tcPr>
+          <w:p>
+            <w:pPr>
+              <w:spacing w:before="20" w:after="20"/>
+            </w:pPr>
+            <w:r>
+              <w:rPr>
+                <w:sz w:val="16"/>
+              </w:rPr>
+              <w:t xml:space="preserve">20</w:t>
+            </w:r>
+          </w:p>
+        </w:tc>
+        <w:tc>
+          <w:tcPr>
+            <w:tcW w:w="2200" w:type="dxa"/>
+          </w:tcPr>
+          <w:p>
+            <w:pPr>
+              <w:spacing w:before="20" w:after="20"/>
+            </w:pPr>
+            <w:r>
+              <w:rPr>
+                <w:sz w:val="16"/>
+                <w:i/>
+              </w:rPr>
+              <w:t xml:space="preserve">Petaurus breviceps</w:t>
+            </w:r>
+          </w:p>
+        </w:tc>
+        <w:tc>
+          <w:tcPr>
+            <w:tcW w:w="2000" w:type="dxa"/>
+          </w:tcPr>
+          <w:p>
+            <w:pPr>
+              <w:spacing w:before="20" w:after="20"/>
+            </w:pPr>
+            <w:r>
+              <w:rPr>
+                <w:sz w:val="16"/>
+              </w:rPr>
+              <w:t xml:space="preserve">Sugar Glider</w:t>
+            </w:r>
+          </w:p>
+        </w:tc>
+        <w:tc>
+          <w:tcPr>
+            <w:tcW w:w="900" w:type="dxa"/>
+          </w:tcPr>
+          <w:p>
+            <w:pPr>
+              <w:spacing w:before="20" w:after="20"/>
+            </w:pPr>
+            <w:r>
+              <w:rPr>
+                <w:sz w:val="16"/>
+              </w:rPr>
+              <w:t xml:space="preserve">Mammal</w:t>
+            </w:r>
+          </w:p>
+        </w:tc>
+        <w:tc>
+          <w:tcPr>
+            <w:tcW w:w="900" w:type="dxa"/>
+          </w:tcPr>
+          <w:p>
+            <w:pPr>
+              <w:spacing w:before="20" w:after="20"/>
+            </w:pPr>
+            <w:r>
+              <w:rPr>
+                <w:sz w:val="16"/>
+              </w:rPr>
+              <w:t xml:space="preserve">227</w:t>
+            </w:r>
+          </w:p>
+        </w:tc>
+        <w:tc>
+          <w:tcPr>
+            <w:tcW w:w="1000" w:type="dxa"/>
+          </w:tcPr>
+          <w:p>
+            <w:pPr>
+              <w:spacing w:before="20" w:after="20"/>
+            </w:pPr>
+            <w:r>
+              <w:rPr>
+                <w:sz w:val="16"/>
+              </w:rPr>
+              <w:t xml:space="preserve">55</w:t>
+            </w:r>
+          </w:p>
+        </w:tc>
+        <w:tc>
+          <w:tcPr>
+            <w:tcW w:w="1000" w:type="dxa"/>
+          </w:tcPr>
+          <w:p>
+            <w:pPr>
+              <w:spacing w:before="20" w:after="20"/>
+            </w:pPr>
+            <w:r>
+              <w:rPr>
+                <w:sz w:val="16"/>
+              </w:rPr>
+              <w:t xml:space="preserve">Standard</w:t>
+            </w:r>
+          </w:p>
+        </w:tc>
+        <w:tc>
+          <w:tcPr>
+            <w:tcW w:w="1800" w:type="dxa"/>
+          </w:tcPr>
+          <w:p>
+            <w:pPr>
+              <w:spacing w:before="20" w:after="20"/>
+            </w:pPr>
+            <w:r>
+              <w:rPr>
+                <w:sz w:val="16"/>
+              </w:rPr>
+              <w:t xml:space="preserve"/>
+            </w:r>
+          </w:p>
+        </w:tc>
+      </w:tr>
+      <w:tr>
+        <w:tc>
+          <w:tcPr>
+            <w:tcW w:w="500" w:type="dxa"/>
+          </w:tcPr>
+          <w:p>
+            <w:pPr>
+              <w:spacing w:before="20" w:after="20"/>
+            </w:pPr>
+            <w:r>
+              <w:rPr>
+                <w:sz w:val="16"/>
+              </w:rPr>
+              <w:t xml:space="preserve">21</w:t>
+            </w:r>
+          </w:p>
+        </w:tc>
+        <w:tc>
+          <w:tcPr>
+            <w:tcW w:w="2200" w:type="dxa"/>
+          </w:tcPr>
+          <w:p>
+            <w:pPr>
+              <w:spacing w:before="20" w:after="20"/>
+            </w:pPr>
+            <w:r>
+              <w:rPr>
+                <w:sz w:val="16"/>
+                <w:i/>
+              </w:rPr>
+              <w:t xml:space="preserve">Litoria infrafrenata</w:t>
+            </w:r>
+          </w:p>
+        </w:tc>
+        <w:tc>
+          <w:tcPr>
+            <w:tcW w:w="2000" w:type="dxa"/>
+          </w:tcPr>
+          <w:p>
+            <w:pPr>
+              <w:spacing w:before="20" w:after="20"/>
+            </w:pPr>
+            <w:r>
+              <w:rPr>
+                <w:sz w:val="16"/>
+              </w:rPr>
+              <w:t xml:space="preserve">White-lipped Tree Frog</w:t>
+            </w:r>
+          </w:p>
+        </w:tc>
+        <w:tc>
+          <w:tcPr>
+            <w:tcW w:w="900" w:type="dxa"/>
+          </w:tcPr>
+          <w:p>
+            <w:pPr>
+              <w:spacing w:before="20" w:after="20"/>
+            </w:pPr>
+            <w:r>
+              <w:rPr>
+                <w:sz w:val="16"/>
+              </w:rPr>
+              <w:t xml:space="preserve">Amphibian</w:t>
+            </w:r>
+          </w:p>
+        </w:tc>
+        <w:tc>
+          <w:tcPr>
+            <w:tcW w:w="900" w:type="dxa"/>
+          </w:tcPr>
+          <w:p>
+            <w:pPr>
+              <w:spacing w:before="20" w:after="20"/>
+            </w:pPr>
+            <w:r>
+              <w:rPr>
+                <w:sz w:val="16"/>
+              </w:rPr>
+              <w:t xml:space="preserve">927</w:t>
+            </w:r>
+          </w:p>
+        </w:tc>
+        <w:tc>
+          <w:tcPr>
+            <w:tcW w:w="1000" w:type="dxa"/>
+          </w:tcPr>
+          <w:p>
+            <w:pPr>
+              <w:spacing w:before="20" w:after="20"/>
+            </w:pPr>
+            <w:r>
+              <w:rPr>
+                <w:sz w:val="16"/>
+              </w:rPr>
+              <w:t xml:space="preserve">242</w:t>
+            </w:r>
+          </w:p>
+        </w:tc>
+        <w:tc>
+          <w:tcPr>
+            <w:tcW w:w="1000" w:type="dxa"/>
+          </w:tcPr>
+          <w:p>
+            <w:pPr>
+              <w:spacing w:before="20" w:after="20"/>
+            </w:pPr>
+            <w:r>
+              <w:rPr>
+                <w:sz w:val="16"/>
+              </w:rPr>
+              <w:t xml:space="preserve">Standard</w:t>
+            </w:r>
+          </w:p>
+        </w:tc>
+        <w:tc>
+          <w:tcPr>
+            <w:tcW w:w="1800" w:type="dxa"/>
+          </w:tcPr>
+          <w:p>
+            <w:pPr>
+              <w:spacing w:before="20" w:after="20"/>
+            </w:pPr>
+            <w:r>
+              <w:rPr>
+                <w:sz w:val="16"/>
+              </w:rPr>
+              <w:t xml:space="preserve">GBIF accepted name may be Nyctimystes infrafrenatus; keep the IUCN-facing name you cited</w:t>
+            </w:r>
+          </w:p>
+        </w:tc>
+      </w:tr>
+      <w:tr>
+        <w:tc>
+          <w:tcPr>
+            <w:tcW w:w="500" w:type="dxa"/>
+          </w:tcPr>
+          <w:p>
+            <w:pPr>
+              <w:spacing w:before="20" w:after="20"/>
+            </w:pPr>
+            <w:r>
+              <w:rPr>
+                <w:sz w:val="16"/>
+              </w:rPr>
+              <w:t xml:space="preserve">22</w:t>
+            </w:r>
+          </w:p>
+        </w:tc>
+        <w:tc>
+          <w:tcPr>
+            <w:tcW w:w="2200" w:type="dxa"/>
+          </w:tcPr>
+          <w:p>
+            <w:pPr>
+              <w:spacing w:before="20" w:after="20"/>
+            </w:pPr>
+            <w:r>
+              <w:rPr>
+                <w:sz w:val="16"/>
+                <w:i/>
+              </w:rPr>
+              <w:t xml:space="preserve">Nyctimystes pulcher</w:t>
+            </w:r>
+          </w:p>
+        </w:tc>
+        <w:tc>
+          <w:tcPr>
+            <w:tcW w:w="2000" w:type="dxa"/>
+          </w:tcPr>
+          <w:p>
+            <w:pPr>
+              <w:spacing w:before="20" w:after="20"/>
+            </w:pPr>
+            <w:r>
+              <w:rPr>
+                <w:sz w:val="16"/>
+              </w:rPr>
+              <w:t xml:space="preserve">Beautiful Big-eyed Tree Frog</w:t>
+            </w:r>
+          </w:p>
+        </w:tc>
+        <w:tc>
+          <w:tcPr>
+            <w:tcW w:w="900" w:type="dxa"/>
+          </w:tcPr>
+          <w:p>
+            <w:pPr>
+              <w:spacing w:before="20" w:after="20"/>
+            </w:pPr>
+            <w:r>
+              <w:rPr>
+                <w:sz w:val="16"/>
+              </w:rPr>
+              <w:t xml:space="preserve">Amphibian</w:t>
+            </w:r>
+          </w:p>
+        </w:tc>
+        <w:tc>
+          <w:tcPr>
+            <w:tcW w:w="900" w:type="dxa"/>
+          </w:tcPr>
+          <w:p>
+            <w:pPr>
+              <w:spacing w:before="20" w:after="20"/>
+            </w:pPr>
+            <w:r>
+              <w:rPr>
+                <w:sz w:val="16"/>
+              </w:rPr>
+              <w:t xml:space="preserve">122</w:t>
+            </w:r>
+          </w:p>
+        </w:tc>
+        <w:tc>
+          <w:tcPr>
+            <w:tcW w:w="1000" w:type="dxa"/>
+          </w:tcPr>
+          <w:p>
+            <w:pPr>
+              <w:spacing w:before="20" w:after="20"/>
+            </w:pPr>
+            <w:r>
+              <w:rPr>
+                <w:sz w:val="16"/>
+              </w:rPr>
+              <w:t xml:space="preserve">34</w:t>
+            </w:r>
+          </w:p>
+        </w:tc>
+        <w:tc>
+          <w:tcPr>
+            <w:tcW w:w="1000" w:type="dxa"/>
+          </w:tcPr>
+          <w:p>
+            <w:pPr>
+              <w:spacing w:before="20" w:after="20"/>
+            </w:pPr>
+            <w:r>
+              <w:rPr>
+                <w:sz w:val="16"/>
+              </w:rPr>
+              <w:t xml:space="preserve">Standard</w:t>
+            </w:r>
+          </w:p>
+        </w:tc>
+        <w:tc>
+          <w:tcPr>
+            <w:tcW w:w="1800" w:type="dxa"/>
+          </w:tcPr>
+          <w:p>
+            <w:pPr>
+              <w:spacing w:before="20" w:after="20"/>
+            </w:pPr>
+            <w:r>
+              <w:rPr>
+                <w:sz w:val="16"/>
+              </w:rPr>
+              <w:t xml:space="preserve"/>
+            </w:r>
+          </w:p>
+        </w:tc>
+      </w:tr>
+      <w:tr>
+        <w:tc>
+          <w:tcPr>
+            <w:tcW w:w="500" w:type="dxa"/>
+          </w:tcPr>
+          <w:p>
+            <w:pPr>
+              <w:spacing w:before="20" w:after="20"/>
+            </w:pPr>
+            <w:r>
+              <w:rPr>
+                <w:sz w:val="16"/>
+              </w:rPr>
+              <w:t xml:space="preserve">23</w:t>
+            </w:r>
+          </w:p>
+        </w:tc>
+        <w:tc>
+          <w:tcPr>
+            <w:tcW w:w="2200" w:type="dxa"/>
+          </w:tcPr>
+          <w:p>
+            <w:pPr>
+              <w:spacing w:before="20" w:after="20"/>
+            </w:pPr>
+            <w:r>
+              <w:rPr>
+                <w:sz w:val="16"/>
+                <w:i/>
+              </w:rPr>
+              <w:t xml:space="preserve">Casuarius casuarius</w:t>
+            </w:r>
+          </w:p>
+        </w:tc>
+        <w:tc>
+          <w:tcPr>
+            <w:tcW w:w="2000" w:type="dxa"/>
+          </w:tcPr>
+          <w:p>
+            <w:pPr>
+              <w:spacing w:before="20" w:after="20"/>
+            </w:pPr>
+            <w:r>
+              <w:rPr>
+                <w:sz w:val="16"/>
+              </w:rPr>
+              <w:t xml:space="preserve">Southern Cassowary</w:t>
+            </w:r>
+          </w:p>
+        </w:tc>
+        <w:tc>
+          <w:tcPr>
+            <w:tcW w:w="900" w:type="dxa"/>
+          </w:tcPr>
+          <w:p>
+            <w:pPr>
+              <w:spacing w:before="20" w:after="20"/>
+            </w:pPr>
+            <w:r>
+              <w:rPr>
+                <w:sz w:val="16"/>
+              </w:rPr>
+              <w:t xml:space="preserve">Bird</w:t>
+            </w:r>
+          </w:p>
+        </w:tc>
+        <w:tc>
+          <w:tcPr>
+            <w:tcW w:w="900" w:type="dxa"/>
+          </w:tcPr>
+          <w:p>
+            <w:pPr>
+              <w:spacing w:before="20" w:after="20"/>
+            </w:pPr>
+            <w:r>
+              <w:rPr>
+                <w:sz w:val="16"/>
+              </w:rPr>
+              <w:t xml:space="preserve">108</w:t>
+            </w:r>
+          </w:p>
+        </w:tc>
+        <w:tc>
+          <w:tcPr>
+            <w:tcW w:w="1000" w:type="dxa"/>
+          </w:tcPr>
+          <w:p>
+            <w:pPr>
+              <w:spacing w:before="20" w:after="20"/>
+            </w:pPr>
+            <w:r>
+              <w:rPr>
+                <w:sz w:val="16"/>
+              </w:rPr>
+              <w:t xml:space="preserve">54</w:t>
+            </w:r>
+          </w:p>
+        </w:tc>
+        <w:tc>
+          <w:tcPr>
+            <w:tcW w:w="1000" w:type="dxa"/>
+          </w:tcPr>
+          <w:p>
+            <w:pPr>
+              <w:spacing w:before="20" w:after="20"/>
+            </w:pPr>
+            <w:r>
+              <w:rPr>
+                <w:sz w:val="16"/>
+              </w:rPr>
+              <w:t xml:space="preserve">Standard</w:t>
+            </w:r>
+          </w:p>
+        </w:tc>
+        <w:tc>
+          <w:tcPr>
+            <w:tcW w:w="1800" w:type="dxa"/>
+          </w:tcPr>
+          <w:p>
+            <w:pPr>
+              <w:spacing w:before="20" w:after="20"/>
+            </w:pPr>
+            <w:r>
+              <w:rPr>
+                <w:sz w:val="16"/>
+              </w:rPr>
+              <w:t xml:space="preserve"/>
+            </w:r>
+          </w:p>
+        </w:tc>
+      </w:tr>
+      <w:tr>
+        <w:tc>
+          <w:tcPr>
+            <w:tcW w:w="500" w:type="dxa"/>
+          </w:tcPr>
+          <w:p>
+            <w:pPr>
+              <w:spacing w:before="20" w:after="20"/>
+            </w:pPr>
+            <w:r>
+              <w:rPr>
+                <w:sz w:val="16"/>
+              </w:rPr>
+              <w:t xml:space="preserve">24</w:t>
+            </w:r>
+          </w:p>
+        </w:tc>
+        <w:tc>
+          <w:tcPr>
+            <w:tcW w:w="2200" w:type="dxa"/>
+          </w:tcPr>
+          <w:p>
+            <w:pPr>
+              <w:spacing w:before="20" w:after="20"/>
+            </w:pPr>
+            <w:r>
+              <w:rPr>
+                <w:sz w:val="16"/>
+                <w:i/>
+              </w:rPr>
+              <w:t xml:space="preserve">Paradisaea guilielmi</w:t>
+            </w:r>
+          </w:p>
+        </w:tc>
+        <w:tc>
+          <w:tcPr>
+            <w:tcW w:w="2000" w:type="dxa"/>
+          </w:tcPr>
+          <w:p>
+            <w:pPr>
+              <w:spacing w:before="20" w:after="20"/>
+            </w:pPr>
+            <w:r>
+              <w:rPr>
+                <w:sz w:val="16"/>
+              </w:rPr>
+              <w:t xml:space="preserve">Emperor Bird-of-paradise</w:t>
+            </w:r>
+          </w:p>
+        </w:tc>
+        <w:tc>
+          <w:tcPr>
+            <w:tcW w:w="900" w:type="dxa"/>
+          </w:tcPr>
+          <w:p>
+            <w:pPr>
+              <w:spacing w:before="20" w:after="20"/>
+            </w:pPr>
+            <w:r>
+              <w:rPr>
+                <w:sz w:val="16"/>
+              </w:rPr>
+              <w:t xml:space="preserve">Bird</w:t>
+            </w:r>
+          </w:p>
+        </w:tc>
+        <w:tc>
+          <w:tcPr>
+            <w:tcW w:w="900" w:type="dxa"/>
+          </w:tcPr>
+          <w:p>
+            <w:pPr>
+              <w:spacing w:before="20" w:after="20"/>
+            </w:pPr>
+            <w:r>
+              <w:rPr>
+                <w:sz w:val="16"/>
+              </w:rPr>
+              <w:t xml:space="preserve">128</w:t>
+            </w:r>
+          </w:p>
+        </w:tc>
+        <w:tc>
+          <w:tcPr>
+            <w:tcW w:w="1000" w:type="dxa"/>
+          </w:tcPr>
+          <w:p>
+            <w:pPr>
+              <w:spacing w:before="20" w:after="20"/>
+            </w:pPr>
+            <w:r>
+              <w:rPr>
+                <w:sz w:val="16"/>
+              </w:rPr>
+              <w:t xml:space="preserve">56</w:t>
+            </w:r>
+          </w:p>
+        </w:tc>
+        <w:tc>
+          <w:tcPr>
+            <w:tcW w:w="1000" w:type="dxa"/>
+          </w:tcPr>
+          <w:p>
+            <w:pPr>
+              <w:spacing w:before="20" w:after="20"/>
+            </w:pPr>
+            <w:r>
+              <w:rPr>
+                <w:sz w:val="16"/>
+              </w:rPr>
+              <w:t xml:space="preserve">Standard</w:t>
+            </w:r>
+          </w:p>
+        </w:tc>
+        <w:tc>
+          <w:tcPr>
+            <w:tcW w:w="1800" w:type="dxa"/>
+          </w:tcPr>
+          <w:p>
+            <w:pPr>
+              <w:spacing w:before="20" w:after="20"/>
+            </w:pPr>
+            <w:r>
+              <w:rPr>
+                <w:sz w:val="16"/>
+              </w:rPr>
+              <w:t xml:space="preserve">Also the Week 9 lab training file. Available for the marked maps if no one else has it.</w:t>
+            </w:r>
+          </w:p>
+        </w:tc>
+      </w:tr>
+    </w:tbl>
     <w:p>
       <w:pPr>
         <w:spacing w:before="0" w:after="160" w:line="259" w:lineRule="auto"/>

</xml_diff>

<commit_message>
Remove Quiz 2 and Test 2 references from brief
Students only need to know the assignment due date. Removed the
sentence mentioning Quiz 2 (Week 9) and Test 2 (Week 10) from
the dates section.

Generated with [Devin](https://devin.ai)

Co-Authored-By: Devin <158243242+devin-ai-integration[bot]@users.noreply.github.com>
</commit_message>
<xml_diff>
--- a/practical_assignment/FR422_Assignment_Brief_Habitat_Conservation_Plan.docx
+++ b/practical_assignment/FR422_Assignment_Brief_Habitat_Conservation_Plan.docx
@@ -450,21 +450,6 @@
       <w:pPr>
         <w:spacing w:after="80"/>
       </w:pPr>
-    </w:p>
-    <w:p>
-      <w:pPr>
-        <w:spacing w:before="0" w:after="160" w:line="259" w:lineRule="auto"/>
-      </w:pPr>
-      <w:r>
-        <w:rPr>
-          <w:rFonts w:ascii="Calibri" w:hAnsi="Calibri" w:eastAsia="Calibri"/>
-          <w:b w:val="0"/>
-          <w:i/>
-          <w:color w:val="222222"/>
-          <w:sz w:val="20"/>
-        </w:rPr>
-        <w:t>Quiz 2 is also in Week 9 and Test 2 is also in Week 10. Those dates are unchanged. This due date does not move them.</w:t>
-      </w:r>
     </w:p>
     <w:p>
       <w:pPr>

</xml_diff>